<commit_message>
Update revision statement document
</commit_message>
<xml_diff>
--- a/notes/revision_statement.docx
+++ b/notes/revision_statement.docx
@@ -11,7 +11,7 @@
         <w:rPr>
           <w:rFonts w:hint="eastAsia"/>
         </w:rPr>
-        <w:t xml:space="preserve">硕士学位论文修改说明</w:t>
+        <w:t>硕士学位论文修改说明</w:t>
       </w:r>
     </w:p>
     <w:p>
@@ -36,7 +36,7 @@
         <w:rPr>
           <w:rFonts w:hint="eastAsia"/>
         </w:rPr>
-        <w:t xml:space="preserve">论文题目：</w:t>
+        <w:t>论文题目：</w:t>
       </w:r>
     </w:p>
     <w:p>
@@ -61,7 +61,7 @@
         <w:rPr>
           <w:rFonts w:hint="eastAsia"/>
         </w:rPr>
-        <w:t xml:space="preserve">作者：　　　　学号：　　　　指导教师：</w:t>
+        <w:t>作者：　　　　学号：　　　　指导教师：</w:t>
       </w:r>
     </w:p>
     <w:p>
@@ -86,34 +86,34 @@
         <w:rPr>
           <w:rFonts w:hint="eastAsia"/>
         </w:rPr>
-        <w:t xml:space="preserve">日期：</w:t>
-      </w:r>
-      <w:r>
-        <w:t xml:space="preserve">2026</w:t>
-      </w:r>
-      <w:r>
-        <w:rPr>
-          <w:rFonts w:hint="eastAsia"/>
-        </w:rPr>
-        <w:t xml:space="preserve">年</w:t>
-      </w:r>
-      <w:r>
-        <w:t xml:space="preserve">8</w:t>
-      </w:r>
-      <w:r>
-        <w:rPr>
-          <w:rFonts w:hint="eastAsia"/>
-        </w:rPr>
-        <w:t xml:space="preserve">月</w:t>
-      </w:r>
-      <w:r>
-        <w:t xml:space="preserve">7</w:t>
-      </w:r>
-      <w:r>
-        <w:rPr>
-          <w:rFonts w:hint="eastAsia"/>
-        </w:rPr>
-        <w:t xml:space="preserve">日</w:t>
+        <w:t>日期：</w:t>
+      </w:r>
+      <w:r>
+        <w:t>2026</w:t>
+      </w:r>
+      <w:r>
+        <w:rPr>
+          <w:rFonts w:hint="eastAsia"/>
+        </w:rPr>
+        <w:t>年</w:t>
+      </w:r>
+      <w:r>
+        <w:t>8</w:t>
+      </w:r>
+      <w:r>
+        <w:rPr>
+          <w:rFonts w:hint="eastAsia"/>
+        </w:rPr>
+        <w:t>月</w:t>
+      </w:r>
+      <w:r>
+        <w:t>7</w:t>
+      </w:r>
+      <w:r>
+        <w:rPr>
+          <w:rFonts w:hint="eastAsia"/>
+        </w:rPr>
+        <w:t>日</w:t>
       </w:r>
     </w:p>
     <w:p>
@@ -139,16 +139,16 @@
         <w:rPr>
           <w:rFonts w:hint="eastAsia"/>
         </w:rPr>
-        <w:t xml:space="preserve">感谢评阅专家的意见。现将修改情况逐条说明如下，涉及的修改均已落实到论文第</w:t>
-      </w:r>
-      <w:r>
-        <w:t xml:space="preserve">3</w:t>
-      </w:r>
-      <w:r>
-        <w:rPr>
-          <w:rFonts w:hint="eastAsia"/>
-        </w:rPr>
-        <w:t xml:space="preserve">章正文与参考文献表。</w:t>
+        <w:t>感谢评阅专家的意见。现将修改情况逐条说明如下，涉及的修改均已落实到论文第</w:t>
+      </w:r>
+      <w:r>
+        <w:t>3</w:t>
+      </w:r>
+      <w:r>
+        <w:rPr>
+          <w:rFonts w:hint="eastAsia"/>
+        </w:rPr>
+        <w:t>章正文与参考文献表。</w:t>
       </w:r>
     </w:p>
     <w:p>
@@ -160,16 +160,16 @@
         <w:rPr>
           <w:rFonts w:hint="eastAsia"/>
         </w:rPr>
-        <w:t xml:space="preserve">意见一：</w:t>
-      </w:r>
-      <w:r>
-        <w:t xml:space="preserve">3.3</w:t>
-      </w:r>
-      <w:r>
-        <w:rPr>
-          <w:rFonts w:hint="eastAsia"/>
-        </w:rPr>
-        <w:t xml:space="preserve">节的表格只列出三个实例的测试结果，未与参考文献比较，建议用表格形式进行比较</w:t>
+        <w:t>意见一：</w:t>
+      </w:r>
+      <w:r>
+        <w:t>3.3</w:t>
+      </w:r>
+      <w:r>
+        <w:rPr>
+          <w:rFonts w:hint="eastAsia"/>
+        </w:rPr>
+        <w:t>节的表格只列出三个实例的测试结果，未与参考文献比较，建议用表格形式进行比较</w:t>
       </w:r>
     </w:p>
     <w:p>
@@ -195,133 +195,133 @@
         <w:rPr>
           <w:rFonts w:hint="eastAsia"/>
         </w:rPr>
-        <w:t xml:space="preserve">修改说明。原稿把与同类工作的比较写在正文里，表格只承载本文自身的结果，确实不便对照。现已在</w:t>
-      </w:r>
-      <w:r>
-        <w:t xml:space="preserve">3.3</w:t>
-      </w:r>
-      <w:r>
-        <w:rPr>
-          <w:rFonts w:hint="eastAsia"/>
-        </w:rPr>
-        <w:t xml:space="preserve">节的三个基准处各增一张对照表，把原来的文字比较改为表格，正文只保留判断。三张表分别是：</w:t>
-      </w:r>
-      <w:r>
-        <w:t xml:space="preserve">3.3.1</w:t>
-      </w:r>
-      <w:r>
-        <w:rPr>
-          <w:rFonts w:hint="eastAsia"/>
-        </w:rPr>
-        <w:t xml:space="preserve">节表</w:t>
-      </w:r>
-      <w:r>
-        <w:t xml:space="preserve">3.3</w:t>
-      </w:r>
-      <w:r>
-        <w:rPr>
-          <w:rFonts w:hint="eastAsia"/>
-        </w:rPr>
-        <w:t xml:space="preserve">，三个</w:t>
-      </w:r>
-      <w:r>
-        <w:t xml:space="preserve">G-set</w:t>
-      </w:r>
-      <w:r>
-        <w:rPr>
-          <w:rFonts w:hint="eastAsia"/>
-        </w:rPr>
-        <w:t xml:space="preserve">实例与已发表求解器的对照；</w:t>
-      </w:r>
-      <w:r>
-        <w:t xml:space="preserve">3.3.2</w:t>
-      </w:r>
-      <w:r>
-        <w:rPr>
-          <w:rFonts w:hint="eastAsia"/>
-        </w:rPr>
-        <w:t xml:space="preserve">节表</w:t>
-      </w:r>
-      <w:r>
-        <w:t xml:space="preserve">3.6</w:t>
-      </w:r>
-      <w:r>
-        <w:rPr>
-          <w:rFonts w:hint="eastAsia"/>
-        </w:rPr>
-        <w:t xml:space="preserve">，整数分解与两项已发表工作的编码规模对照；</w:t>
-      </w:r>
-      <w:r>
-        <w:t xml:space="preserve">3.3.3</w:t>
-      </w:r>
-      <w:r>
-        <w:rPr>
-          <w:rFonts w:hint="eastAsia"/>
-        </w:rPr>
-        <w:t xml:space="preserve">节表</w:t>
-      </w:r>
-      <w:r>
-        <w:t xml:space="preserve">3.9</w:t>
-      </w:r>
-      <w:r>
-        <w:rPr>
-          <w:rFonts w:hint="eastAsia"/>
-        </w:rPr>
-        <w:t xml:space="preserve">，三个</w:t>
-      </w:r>
-      <w:r>
-        <w:t xml:space="preserve">TSPLIB</w:t>
-      </w:r>
-      <w:r>
-        <w:rPr>
-          <w:rFonts w:hint="eastAsia"/>
-        </w:rPr>
-        <w:t xml:space="preserve">实例与</w:t>
-      </w:r>
-      <w:r>
-        <w:t xml:space="preserve">D-Wave</w:t>
-      </w:r>
-      <w:r>
-        <w:rPr>
-          <w:rFonts w:hint="eastAsia"/>
-        </w:rPr>
-        <w:t xml:space="preserve">两种混合求解器的对照。新增表格使原表</w:t>
-      </w:r>
-      <w:r>
-        <w:t xml:space="preserve">3.3</w:t>
-      </w:r>
-      <w:r>
-        <w:rPr>
-          <w:rFonts w:hint="eastAsia"/>
-        </w:rPr>
-        <w:t xml:space="preserve">至表</w:t>
-      </w:r>
-      <w:r>
-        <w:t xml:space="preserve">3.9</w:t>
-      </w:r>
-      <w:r>
-        <w:rPr>
-          <w:rFonts w:hint="eastAsia"/>
-        </w:rPr>
-        <w:t xml:space="preserve">顺延为表</w:t>
-      </w:r>
-      <w:r>
-        <w:t xml:space="preserve">3.4</w:t>
-      </w:r>
-      <w:r>
-        <w:rPr>
-          <w:rFonts w:hint="eastAsia"/>
-        </w:rPr>
-        <w:t xml:space="preserve">至表</w:t>
-      </w:r>
-      <w:r>
-        <w:t xml:space="preserve">3.12</w:t>
-      </w:r>
-      <w:r>
-        <w:rPr>
-          <w:rFonts w:hint="eastAsia"/>
-        </w:rPr>
-        <w:t xml:space="preserve">，正文中的相应引用已同步更新。</w:t>
+        <w:t>修改说明。原稿把与同类工作的比较写在正文里，表格只承载本文自身的结果，确实不便对照。现已在</w:t>
+      </w:r>
+      <w:r>
+        <w:t>3.3</w:t>
+      </w:r>
+      <w:r>
+        <w:rPr>
+          <w:rFonts w:hint="eastAsia"/>
+        </w:rPr>
+        <w:t>节的三个基准处各增一张对照表，把原来的文字比较改为表格，正文只保留判断。三张表分别是：</w:t>
+      </w:r>
+      <w:r>
+        <w:t>3.3.1</w:t>
+      </w:r>
+      <w:r>
+        <w:rPr>
+          <w:rFonts w:hint="eastAsia"/>
+        </w:rPr>
+        <w:t>节表</w:t>
+      </w:r>
+      <w:r>
+        <w:t>3.3</w:t>
+      </w:r>
+      <w:r>
+        <w:rPr>
+          <w:rFonts w:hint="eastAsia"/>
+        </w:rPr>
+        <w:t>，三个</w:t>
+      </w:r>
+      <w:r>
+        <w:t>G-set</w:t>
+      </w:r>
+      <w:r>
+        <w:rPr>
+          <w:rFonts w:hint="eastAsia"/>
+        </w:rPr>
+        <w:t>实例与已发表求解器的对照；</w:t>
+      </w:r>
+      <w:r>
+        <w:t>3.3.2</w:t>
+      </w:r>
+      <w:r>
+        <w:rPr>
+          <w:rFonts w:hint="eastAsia"/>
+        </w:rPr>
+        <w:t>节表</w:t>
+      </w:r>
+      <w:r>
+        <w:t>3.6</w:t>
+      </w:r>
+      <w:r>
+        <w:rPr>
+          <w:rFonts w:hint="eastAsia"/>
+        </w:rPr>
+        <w:t>，整数分解与两项已发表工作的编码规模对照；</w:t>
+      </w:r>
+      <w:r>
+        <w:t>3.3.3</w:t>
+      </w:r>
+      <w:r>
+        <w:rPr>
+          <w:rFonts w:hint="eastAsia"/>
+        </w:rPr>
+        <w:t>节表</w:t>
+      </w:r>
+      <w:r>
+        <w:t>3.9</w:t>
+      </w:r>
+      <w:r>
+        <w:rPr>
+          <w:rFonts w:hint="eastAsia"/>
+        </w:rPr>
+        <w:t>，三个</w:t>
+      </w:r>
+      <w:r>
+        <w:t>TSPLIB</w:t>
+      </w:r>
+      <w:r>
+        <w:rPr>
+          <w:rFonts w:hint="eastAsia"/>
+        </w:rPr>
+        <w:t>实例与</w:t>
+      </w:r>
+      <w:r>
+        <w:t>D-Wave</w:t>
+      </w:r>
+      <w:r>
+        <w:rPr>
+          <w:rFonts w:hint="eastAsia"/>
+        </w:rPr>
+        <w:t>两种混合求解器的对照。新增表格使原表</w:t>
+      </w:r>
+      <w:r>
+        <w:t>3.3</w:t>
+      </w:r>
+      <w:r>
+        <w:rPr>
+          <w:rFonts w:hint="eastAsia"/>
+        </w:rPr>
+        <w:t>至表</w:t>
+      </w:r>
+      <w:r>
+        <w:t>3.9</w:t>
+      </w:r>
+      <w:r>
+        <w:rPr>
+          <w:rFonts w:hint="eastAsia"/>
+        </w:rPr>
+        <w:t>顺延为表</w:t>
+      </w:r>
+      <w:r>
+        <w:t>3.4</w:t>
+      </w:r>
+      <w:r>
+        <w:rPr>
+          <w:rFonts w:hint="eastAsia"/>
+        </w:rPr>
+        <w:t>至表</w:t>
+      </w:r>
+      <w:r>
+        <w:t>3.12</w:t>
+      </w:r>
+      <w:r>
+        <w:rPr>
+          <w:rFonts w:hint="eastAsia"/>
+        </w:rPr>
+        <w:t>，正文中的相应引用已同步更新。</w:t>
       </w:r>
     </w:p>
     <w:p>
@@ -347,43 +347,43 @@
         <w:rPr>
           <w:rFonts w:hint="eastAsia"/>
         </w:rPr>
-        <w:t xml:space="preserve">对照表新增了原稿没有的文献数据点。表</w:t>
-      </w:r>
-      <w:r>
-        <w:t xml:space="preserve">3.3</w:t>
-      </w:r>
-      <w:r>
-        <w:rPr>
-          <w:rFonts w:hint="eastAsia"/>
-        </w:rPr>
-        <w:t xml:space="preserve">增列</w:t>
-      </w:r>
-      <w:r>
-        <w:t xml:space="preserve">Onizawa</w:t>
-      </w:r>
-      <w:r>
-        <w:rPr>
-          <w:rFonts w:hint="eastAsia"/>
-        </w:rPr>
-        <w:t xml:space="preserve">和</w:t>
-      </w:r>
-      <w:r>
-        <w:t xml:space="preserve">Hanyu</w:t>
-      </w:r>
-      <w:r>
-        <w:rPr>
-          <w:rFonts w:hint="eastAsia"/>
-        </w:rPr>
-        <w:t xml:space="preserve">的</w:t>
-      </w:r>
-      <w:r>
-        <w:t xml:space="preserve">p-bit</w:t>
-      </w:r>
-      <w:r>
-        <w:rPr>
-          <w:rFonts w:hint="eastAsia"/>
-        </w:rPr>
-        <w:t xml:space="preserve">模拟退火</w:t>
+        <w:t>对照表新增了原稿没有的文献数据点。表</w:t>
+      </w:r>
+      <w:r>
+        <w:t>3.3</w:t>
+      </w:r>
+      <w:r>
+        <w:rPr>
+          <w:rFonts w:hint="eastAsia"/>
+        </w:rPr>
+        <w:t>增列</w:t>
+      </w:r>
+      <w:r>
+        <w:t>Onizawa</w:t>
+      </w:r>
+      <w:r>
+        <w:rPr>
+          <w:rFonts w:hint="eastAsia"/>
+        </w:rPr>
+        <w:t>和</w:t>
+      </w:r>
+      <w:r>
+        <w:t>Hanyu</w:t>
+      </w:r>
+      <w:r>
+        <w:rPr>
+          <w:rFonts w:hint="eastAsia"/>
+        </w:rPr>
+        <w:t>的</w:t>
+      </w:r>
+      <w:r>
+        <w:t>p-bit</w:t>
+      </w:r>
+      <w:r>
+        <w:rPr>
+          <w:rFonts w:hint="eastAsia"/>
+        </w:rPr>
+        <w:t>模拟退火</w:t>
       </w:r>
       <w:r>
         <w:t xml:space="preserve"> (pSA</w:t>
@@ -392,7 +392,7 @@
         <w:rPr>
           <w:rFonts w:hint="eastAsia"/>
         </w:rPr>
-        <w:t xml:space="preserve">与该文报告的时间平均变体</w:t>
+        <w:t>与该文报告的时间平均变体</w:t>
       </w:r>
       <w:r>
         <w:t xml:space="preserve">TApSA) </w:t>
@@ -401,151 +401,151 @@
         <w:rPr>
           <w:rFonts w:hint="eastAsia"/>
         </w:rPr>
-        <w:t xml:space="preserve">在三个实例上的切分均值，以及</w:t>
-      </w:r>
-      <w:r>
-        <w:t xml:space="preserve">Goto</w:t>
-      </w:r>
-      <w:r>
-        <w:rPr>
-          <w:rFonts w:hint="eastAsia"/>
-        </w:rPr>
-        <w:t xml:space="preserve">等的模拟分岔机在</w:t>
-      </w:r>
-      <w:r>
-        <w:t xml:space="preserve">G22</w:t>
-      </w:r>
-      <w:r>
-        <w:rPr>
-          <w:rFonts w:hint="eastAsia"/>
-        </w:rPr>
-        <w:t xml:space="preserve">上的求解时间；表</w:t>
-      </w:r>
-      <w:r>
-        <w:t xml:space="preserve">3.9</w:t>
-      </w:r>
-      <w:r>
-        <w:rPr>
-          <w:rFonts w:hint="eastAsia"/>
-        </w:rPr>
-        <w:t xml:space="preserve">增列</w:t>
-      </w:r>
-      <w:r>
-        <w:t xml:space="preserve">D-Wave</w:t>
-      </w:r>
-      <w:r>
-        <w:rPr>
-          <w:rFonts w:hint="eastAsia"/>
-        </w:rPr>
-        <w:t xml:space="preserve">的</w:t>
-      </w:r>
-      <w:r>
-        <w:t xml:space="preserve">Kerberos</w:t>
-      </w:r>
-      <w:r>
-        <w:rPr>
-          <w:rFonts w:hint="eastAsia"/>
-        </w:rPr>
-        <w:t xml:space="preserve">与</w:t>
-      </w:r>
-      <w:r>
-        <w:t xml:space="preserve">LeapHybridSampler</w:t>
-      </w:r>
-      <w:r>
-        <w:rPr>
-          <w:rFonts w:hint="eastAsia"/>
-        </w:rPr>
-        <w:t xml:space="preserve">在三个</w:t>
-      </w:r>
-      <w:r>
-        <w:t xml:space="preserve">TSPLIB</w:t>
-      </w:r>
-      <w:r>
-        <w:rPr>
-          <w:rFonts w:hint="eastAsia"/>
-        </w:rPr>
-        <w:t xml:space="preserve">实例上的巡回路径长度与相对偏差，覆盖</w:t>
-      </w:r>
-      <w:r>
-        <w:t xml:space="preserve">burma14</w:t>
-      </w:r>
-      <w:r>
-        <w:rPr>
-          <w:rFonts w:hint="eastAsia"/>
-        </w:rPr>
-        <w:t xml:space="preserve">、</w:t>
-      </w:r>
-      <w:r>
-        <w:t xml:space="preserve">ulysses16</w:t>
-      </w:r>
-      <w:r>
-        <w:rPr>
-          <w:rFonts w:hint="eastAsia"/>
-        </w:rPr>
-        <w:t xml:space="preserve">与</w:t>
-      </w:r>
-      <w:r>
-        <w:t xml:space="preserve">gr17</w:t>
-      </w:r>
-      <w:r>
-        <w:rPr>
-          <w:rFonts w:hint="eastAsia"/>
-        </w:rPr>
-        <w:t xml:space="preserve">全部三例，而原稿只在正文提到</w:t>
-      </w:r>
-      <w:r>
-        <w:t xml:space="preserve">ulysses16</w:t>
-      </w:r>
-      <w:r>
-        <w:rPr>
-          <w:rFonts w:hint="eastAsia"/>
-        </w:rPr>
-        <w:t xml:space="preserve">一例；表</w:t>
-      </w:r>
-      <w:r>
-        <w:t xml:space="preserve">3.6</w:t>
-      </w:r>
-      <w:r>
-        <w:rPr>
-          <w:rFonts w:hint="eastAsia"/>
-        </w:rPr>
-        <w:t xml:space="preserve">为新增，把本文的编码规模与</w:t>
-      </w:r>
-      <w:r>
-        <w:t xml:space="preserve">Borders</w:t>
-      </w:r>
-      <w:r>
-        <w:rPr>
-          <w:rFonts w:hint="eastAsia"/>
-        </w:rPr>
-        <w:t xml:space="preserve">等的</w:t>
-      </w:r>
-      <w:r>
-        <w:t xml:space="preserve">sMTJ p-bit</w:t>
-      </w:r>
-      <w:r>
-        <w:rPr>
-          <w:rFonts w:hint="eastAsia"/>
-        </w:rPr>
-        <w:t xml:space="preserve">硬件分解、</w:t>
-      </w:r>
-      <w:r>
-        <w:t xml:space="preserve">Jiang</w:t>
-      </w:r>
-      <w:r>
-        <w:rPr>
-          <w:rFonts w:hint="eastAsia"/>
-        </w:rPr>
-        <w:t xml:space="preserve">等在</w:t>
-      </w:r>
-      <w:r>
-        <w:t xml:space="preserve">D-Wave 2000Q</w:t>
-      </w:r>
-      <w:r>
-        <w:rPr>
-          <w:rFonts w:hint="eastAsia"/>
-        </w:rPr>
-        <w:t xml:space="preserve">上的分解并列。</w:t>
+        <w:t>在三个实例上的切分均值，以及</w:t>
+      </w:r>
+      <w:r>
+        <w:t>Goto</w:t>
+      </w:r>
+      <w:r>
+        <w:rPr>
+          <w:rFonts w:hint="eastAsia"/>
+        </w:rPr>
+        <w:t>等的模拟分岔机在</w:t>
+      </w:r>
+      <w:r>
+        <w:t>G22</w:t>
+      </w:r>
+      <w:r>
+        <w:rPr>
+          <w:rFonts w:hint="eastAsia"/>
+        </w:rPr>
+        <w:t>上的求解时间；表</w:t>
+      </w:r>
+      <w:r>
+        <w:t>3.9</w:t>
+      </w:r>
+      <w:r>
+        <w:rPr>
+          <w:rFonts w:hint="eastAsia"/>
+        </w:rPr>
+        <w:t>增列</w:t>
+      </w:r>
+      <w:r>
+        <w:t>D-Wave</w:t>
+      </w:r>
+      <w:r>
+        <w:rPr>
+          <w:rFonts w:hint="eastAsia"/>
+        </w:rPr>
+        <w:t>的</w:t>
+      </w:r>
+      <w:r>
+        <w:t>Kerberos</w:t>
+      </w:r>
+      <w:r>
+        <w:rPr>
+          <w:rFonts w:hint="eastAsia"/>
+        </w:rPr>
+        <w:t>与</w:t>
+      </w:r>
+      <w:r>
+        <w:t>LeapHybridSampler</w:t>
+      </w:r>
+      <w:r>
+        <w:rPr>
+          <w:rFonts w:hint="eastAsia"/>
+        </w:rPr>
+        <w:t>在三个</w:t>
+      </w:r>
+      <w:r>
+        <w:t>TSPLIB</w:t>
+      </w:r>
+      <w:r>
+        <w:rPr>
+          <w:rFonts w:hint="eastAsia"/>
+        </w:rPr>
+        <w:t>实例上的巡回路径长度与相对偏差，覆盖</w:t>
+      </w:r>
+      <w:r>
+        <w:t>burma14</w:t>
+      </w:r>
+      <w:r>
+        <w:rPr>
+          <w:rFonts w:hint="eastAsia"/>
+        </w:rPr>
+        <w:t>、</w:t>
+      </w:r>
+      <w:r>
+        <w:t>ulysses16</w:t>
+      </w:r>
+      <w:r>
+        <w:rPr>
+          <w:rFonts w:hint="eastAsia"/>
+        </w:rPr>
+        <w:t>与</w:t>
+      </w:r>
+      <w:r>
+        <w:t>gr17</w:t>
+      </w:r>
+      <w:r>
+        <w:rPr>
+          <w:rFonts w:hint="eastAsia"/>
+        </w:rPr>
+        <w:t>全部三例，而原稿只在正文提到</w:t>
+      </w:r>
+      <w:r>
+        <w:t>ulysses16</w:t>
+      </w:r>
+      <w:r>
+        <w:rPr>
+          <w:rFonts w:hint="eastAsia"/>
+        </w:rPr>
+        <w:t>一例；表</w:t>
+      </w:r>
+      <w:r>
+        <w:t>3.6</w:t>
+      </w:r>
+      <w:r>
+        <w:rPr>
+          <w:rFonts w:hint="eastAsia"/>
+        </w:rPr>
+        <w:t>为新增，把本文的编码规模与</w:t>
+      </w:r>
+      <w:r>
+        <w:t>Borders</w:t>
+      </w:r>
+      <w:r>
+        <w:rPr>
+          <w:rFonts w:hint="eastAsia"/>
+        </w:rPr>
+        <w:t>等的</w:t>
+      </w:r>
+      <w:r>
+        <w:t>sMTJ p-bit</w:t>
+      </w:r>
+      <w:r>
+        <w:rPr>
+          <w:rFonts w:hint="eastAsia"/>
+        </w:rPr>
+        <w:t>硬件分解、</w:t>
+      </w:r>
+      <w:r>
+        <w:t>Jiang</w:t>
+      </w:r>
+      <w:r>
+        <w:rPr>
+          <w:rFonts w:hint="eastAsia"/>
+        </w:rPr>
+        <w:t>等在</w:t>
+      </w:r>
+      <w:r>
+        <w:t>D-Wave 2000Q</w:t>
+      </w:r>
+      <w:r>
+        <w:rPr>
+          <w:rFonts w:hint="eastAsia"/>
+        </w:rPr>
+        <w:t>上的分解并列。</w:t>
       </w:r>
     </w:p>
     <w:p>
@@ -571,106 +571,106 @@
         <w:rPr>
           <w:rFonts w:hint="eastAsia"/>
         </w:rPr>
-        <w:t xml:space="preserve">每张表都列出平台与统计口径，并在表注中写明不可直接排名的原因。这些工作的处理器、停止判据与统计量互不相同：本文与</w:t>
-      </w:r>
-      <w:r>
-        <w:t xml:space="preserve">Benlic</w:t>
-      </w:r>
-      <w:r>
-        <w:rPr>
-          <w:rFonts w:hint="eastAsia"/>
-        </w:rPr>
-        <w:t xml:space="preserve">和</w:t>
-      </w:r>
-      <w:r>
-        <w:t xml:space="preserve">Hao</w:t>
-      </w:r>
-      <w:r>
-        <w:rPr>
-          <w:rFonts w:hint="eastAsia"/>
-        </w:rPr>
-        <w:t xml:space="preserve">的</w:t>
-      </w:r>
-      <w:r>
-        <w:t xml:space="preserve">BLS</w:t>
-      </w:r>
-      <w:r>
-        <w:rPr>
-          <w:rFonts w:hint="eastAsia"/>
-        </w:rPr>
-        <w:t xml:space="preserve">报告的是命中最优所需时间，前者为</w:t>
-      </w:r>
-      <w:r>
-        <w:t xml:space="preserve">200</w:t>
-      </w:r>
-      <w:r>
-        <w:rPr>
-          <w:rFonts w:hint="eastAsia"/>
-        </w:rPr>
-        <w:t xml:space="preserve">次试验导出的</w:t>
-      </w:r>
-      <w:r>
-        <w:t xml:space="preserve">99%</w:t>
-      </w:r>
-      <w:r>
-        <w:rPr>
-          <w:rFonts w:hint="eastAsia"/>
-        </w:rPr>
-        <w:t xml:space="preserve">置信求解时间，后者为</w:t>
-      </w:r>
-      <w:r>
-        <w:t xml:space="preserve">20</w:t>
-      </w:r>
-      <w:r>
-        <w:rPr>
-          <w:rFonts w:hint="eastAsia"/>
-        </w:rPr>
-        <w:t xml:space="preserve">次运行达到最好解的平均用时；</w:t>
-      </w:r>
-      <w:r>
-        <w:t xml:space="preserve">Onizawa</w:t>
-      </w:r>
-      <w:r>
-        <w:rPr>
-          <w:rFonts w:hint="eastAsia"/>
-        </w:rPr>
-        <w:t xml:space="preserve">和</w:t>
-      </w:r>
-      <w:r>
-        <w:t xml:space="preserve">Hanyu</w:t>
-      </w:r>
-      <w:r>
-        <w:rPr>
-          <w:rFonts w:hint="eastAsia"/>
-        </w:rPr>
-        <w:t xml:space="preserve">报告的是</w:t>
-      </w:r>
-      <w:r>
-        <w:t xml:space="preserve">100</w:t>
-      </w:r>
-      <w:r>
-        <w:rPr>
-          <w:rFonts w:hint="eastAsia"/>
-        </w:rPr>
-        <w:t xml:space="preserve">次试验的切分均值而非命中率；</w:t>
-      </w:r>
-      <w:r>
-        <w:t xml:space="preserve">Goto</w:t>
-      </w:r>
-      <w:r>
-        <w:rPr>
-          <w:rFonts w:hint="eastAsia"/>
-        </w:rPr>
-        <w:t xml:space="preserve">等的求解时间由</w:t>
-      </w:r>
-      <w:r>
-        <w:t xml:space="preserve">FPGA</w:t>
-      </w:r>
-      <w:r>
-        <w:rPr>
-          <w:rFonts w:hint="eastAsia"/>
-        </w:rPr>
-        <w:t xml:space="preserve">并行实现给出。表注逐条标注了这些差异，避免读者把跨论文的时间列读成速度排名。</w:t>
+        <w:t>每张表都列出平台与统计口径，并在表注中写明不可直接排名的原因。这些工作的处理器、停止判据与统计量互不相同：本文与</w:t>
+      </w:r>
+      <w:r>
+        <w:t>Benlic</w:t>
+      </w:r>
+      <w:r>
+        <w:rPr>
+          <w:rFonts w:hint="eastAsia"/>
+        </w:rPr>
+        <w:t>和</w:t>
+      </w:r>
+      <w:r>
+        <w:t>Hao</w:t>
+      </w:r>
+      <w:r>
+        <w:rPr>
+          <w:rFonts w:hint="eastAsia"/>
+        </w:rPr>
+        <w:t>的</w:t>
+      </w:r>
+      <w:r>
+        <w:t>BLS</w:t>
+      </w:r>
+      <w:r>
+        <w:rPr>
+          <w:rFonts w:hint="eastAsia"/>
+        </w:rPr>
+        <w:t>报告的是命中最优所需时间，前者为</w:t>
+      </w:r>
+      <w:r>
+        <w:t>200</w:t>
+      </w:r>
+      <w:r>
+        <w:rPr>
+          <w:rFonts w:hint="eastAsia"/>
+        </w:rPr>
+        <w:t>次试验导出的</w:t>
+      </w:r>
+      <w:r>
+        <w:t>99%</w:t>
+      </w:r>
+      <w:r>
+        <w:rPr>
+          <w:rFonts w:hint="eastAsia"/>
+        </w:rPr>
+        <w:t>置信求解时间，后者为</w:t>
+      </w:r>
+      <w:r>
+        <w:t>20</w:t>
+      </w:r>
+      <w:r>
+        <w:rPr>
+          <w:rFonts w:hint="eastAsia"/>
+        </w:rPr>
+        <w:t>次运行达到最好解的平均用时；</w:t>
+      </w:r>
+      <w:r>
+        <w:t>Onizawa</w:t>
+      </w:r>
+      <w:r>
+        <w:rPr>
+          <w:rFonts w:hint="eastAsia"/>
+        </w:rPr>
+        <w:t>和</w:t>
+      </w:r>
+      <w:r>
+        <w:t>Hanyu</w:t>
+      </w:r>
+      <w:r>
+        <w:rPr>
+          <w:rFonts w:hint="eastAsia"/>
+        </w:rPr>
+        <w:t>报告的是</w:t>
+      </w:r>
+      <w:r>
+        <w:t>100</w:t>
+      </w:r>
+      <w:r>
+        <w:rPr>
+          <w:rFonts w:hint="eastAsia"/>
+        </w:rPr>
+        <w:t>次试验的切分均值而非命中率；</w:t>
+      </w:r>
+      <w:r>
+        <w:t>Goto</w:t>
+      </w:r>
+      <w:r>
+        <w:rPr>
+          <w:rFonts w:hint="eastAsia"/>
+        </w:rPr>
+        <w:t>等的求解时间由</w:t>
+      </w:r>
+      <w:r>
+        <w:t>FPGA</w:t>
+      </w:r>
+      <w:r>
+        <w:rPr>
+          <w:rFonts w:hint="eastAsia"/>
+        </w:rPr>
+        <w:t>并行实现给出。表注逐条标注了这些差异，避免读者把跨论文的时间列读成速度排名。</w:t>
       </w:r>
     </w:p>
     <w:p>
@@ -696,268 +696,268 @@
         <w:rPr>
           <w:rFonts w:hint="eastAsia"/>
         </w:rPr>
-        <w:t xml:space="preserve">在整理对照表的过程中，核对文献原文发现原稿两处引用数值有误，一并更正。其一，原稿称</w:t>
-      </w:r>
-      <w:r>
-        <w:t xml:space="preserve">BLS</w:t>
-      </w:r>
-      <w:r>
-        <w:rPr>
-          <w:rFonts w:hint="eastAsia"/>
-        </w:rPr>
-        <w:t xml:space="preserve">在</w:t>
-      </w:r>
-      <w:r>
-        <w:t xml:space="preserve">G1</w:t>
-      </w:r>
-      <w:r>
-        <w:rPr>
-          <w:rFonts w:hint="eastAsia"/>
-        </w:rPr>
-        <w:t xml:space="preserve">上约</w:t>
-      </w:r>
-      <w:r>
-        <w:t xml:space="preserve">2</w:t>
-      </w:r>
-      <w:r>
-        <w:rPr>
-          <w:rFonts w:hint="eastAsia"/>
-        </w:rPr>
-        <w:t xml:space="preserve">至</w:t>
-      </w:r>
-      <w:r>
-        <w:t xml:space="preserve">3</w:t>
-      </w:r>
-      <w:r>
-        <w:rPr>
-          <w:rFonts w:hint="eastAsia"/>
-        </w:rPr>
-        <w:t xml:space="preserve">秒达到最好解，核对该文表</w:t>
-      </w:r>
-      <w:r>
-        <w:t xml:space="preserve">2</w:t>
-      </w:r>
-      <w:r>
-        <w:rPr>
-          <w:rFonts w:hint="eastAsia"/>
-        </w:rPr>
-        <w:t xml:space="preserve">，</w:t>
-      </w:r>
-      <w:r>
-        <w:t xml:space="preserve">G1</w:t>
-      </w:r>
-      <w:r>
-        <w:rPr>
-          <w:rFonts w:hint="eastAsia"/>
-        </w:rPr>
-        <w:t xml:space="preserve">的平均用时为</w:t>
-      </w:r>
-      <w:r>
-        <w:t xml:space="preserve">13</w:t>
-      </w:r>
-      <w:r>
-        <w:rPr>
-          <w:rFonts w:hint="eastAsia"/>
-        </w:rPr>
-        <w:t xml:space="preserve">秒，</w:t>
-      </w:r>
-      <w:r>
-        <w:t xml:space="preserve">2</w:t>
-      </w:r>
-      <w:r>
-        <w:rPr>
-          <w:rFonts w:hint="eastAsia"/>
-        </w:rPr>
-        <w:t xml:space="preserve">至</w:t>
-      </w:r>
-      <w:r>
-        <w:t xml:space="preserve">3</w:t>
-      </w:r>
-      <w:r>
-        <w:rPr>
-          <w:rFonts w:hint="eastAsia"/>
-        </w:rPr>
-        <w:t xml:space="preserve">秒对应的是同表中</w:t>
-      </w:r>
-      <w:r>
-        <w:t xml:space="preserve">G11</w:t>
-      </w:r>
-      <w:r>
-        <w:rPr>
-          <w:rFonts w:hint="eastAsia"/>
-        </w:rPr>
-        <w:t xml:space="preserve">至</w:t>
-      </w:r>
-      <w:r>
-        <w:t xml:space="preserve">G13</w:t>
-      </w:r>
-      <w:r>
-        <w:rPr>
-          <w:rFonts w:hint="eastAsia"/>
-        </w:rPr>
-        <w:t xml:space="preserve">三个实例。其二，原稿称</w:t>
-      </w:r>
-      <w:r>
-        <w:t xml:space="preserve">pSA</w:t>
-      </w:r>
-      <w:r>
-        <w:rPr>
-          <w:rFonts w:hint="eastAsia"/>
-        </w:rPr>
-        <w:t xml:space="preserve">在</w:t>
-      </w:r>
-      <w:r>
-        <w:t xml:space="preserve">G1</w:t>
-      </w:r>
-      <w:r>
-        <w:rPr>
-          <w:rFonts w:hint="eastAsia"/>
-        </w:rPr>
-        <w:t xml:space="preserve">上的归一化切分均值为</w:t>
-      </w:r>
-      <w:r>
-        <w:t xml:space="preserve">0.996</w:t>
-      </w:r>
-      <w:r>
-        <w:rPr>
-          <w:rFonts w:hint="eastAsia"/>
-        </w:rPr>
-        <w:t xml:space="preserve">至</w:t>
-      </w:r>
-      <w:r>
-        <w:t xml:space="preserve">0.998</w:t>
-      </w:r>
-      <w:r>
-        <w:rPr>
-          <w:rFonts w:hint="eastAsia"/>
-        </w:rPr>
-        <w:t xml:space="preserve">、其改进型达到</w:t>
-      </w:r>
-      <w:r>
-        <w:t xml:space="preserve">0.999</w:t>
-      </w:r>
-      <w:r>
-        <w:rPr>
-          <w:rFonts w:hint="eastAsia"/>
-        </w:rPr>
-        <w:t xml:space="preserve">以上，核对该文表</w:t>
-      </w:r>
-      <w:r>
-        <w:t xml:space="preserve">5</w:t>
-      </w:r>
-      <w:r>
-        <w:rPr>
-          <w:rFonts w:hint="eastAsia"/>
-        </w:rPr>
-        <w:t xml:space="preserve">与表</w:t>
-      </w:r>
-      <w:r>
-        <w:t xml:space="preserve">6</w:t>
-      </w:r>
-      <w:r>
-        <w:rPr>
-          <w:rFonts w:hint="eastAsia"/>
-        </w:rPr>
-        <w:t xml:space="preserve">，</w:t>
-      </w:r>
-      <w:r>
-        <w:t xml:space="preserve">pSA</w:t>
-      </w:r>
-      <w:r>
-        <w:rPr>
-          <w:rFonts w:hint="eastAsia"/>
-        </w:rPr>
-        <w:t xml:space="preserve">在</w:t>
-      </w:r>
-      <w:r>
-        <w:t xml:space="preserve">G1</w:t>
-      </w:r>
-      <w:r>
-        <w:rPr>
-          <w:rFonts w:hint="eastAsia"/>
-        </w:rPr>
-        <w:t xml:space="preserve">、</w:t>
-      </w:r>
-      <w:r>
-        <w:t xml:space="preserve">G14</w:t>
-      </w:r>
-      <w:r>
-        <w:rPr>
-          <w:rFonts w:hint="eastAsia"/>
-        </w:rPr>
-        <w:t xml:space="preserve">、</w:t>
-      </w:r>
-      <w:r>
-        <w:t xml:space="preserve">G22</w:t>
-      </w:r>
-      <w:r>
-        <w:rPr>
-          <w:rFonts w:hint="eastAsia"/>
-        </w:rPr>
-        <w:t xml:space="preserve">三个全正权实例上的切分均值均为零，其改进型</w:t>
-      </w:r>
-      <w:r>
-        <w:t xml:space="preserve">TApSA</w:t>
-      </w:r>
-      <w:r>
-        <w:rPr>
-          <w:rFonts w:hint="eastAsia"/>
-        </w:rPr>
-        <w:t xml:space="preserve">的归一化切分为</w:t>
-      </w:r>
-      <w:r>
-        <w:t xml:space="preserve">0.996</w:t>
-      </w:r>
-      <w:r>
-        <w:rPr>
-          <w:rFonts w:hint="eastAsia"/>
-        </w:rPr>
-        <w:t xml:space="preserve">、</w:t>
-      </w:r>
-      <w:r>
-        <w:t xml:space="preserve">0.991</w:t>
-      </w:r>
-      <w:r>
-        <w:rPr>
-          <w:rFonts w:hint="eastAsia"/>
-        </w:rPr>
-        <w:t xml:space="preserve">与</w:t>
-      </w:r>
-      <w:r>
-        <w:t xml:space="preserve">0.994</w:t>
-      </w:r>
-      <w:r>
-        <w:rPr>
-          <w:rFonts w:hint="eastAsia"/>
-        </w:rPr>
-        <w:t xml:space="preserve">，全文没有</w:t>
-      </w:r>
-      <w:r>
-        <w:t xml:space="preserve">0.999</w:t>
-      </w:r>
-      <w:r>
-        <w:rPr>
-          <w:rFonts w:hint="eastAsia"/>
-        </w:rPr>
-        <w:t xml:space="preserve">以上的取值。该文的论点正是常规</w:t>
-      </w:r>
-      <w:r>
-        <w:t xml:space="preserve">pSA</w:t>
-      </w:r>
-      <w:r>
-        <w:rPr>
-          <w:rFonts w:hint="eastAsia"/>
-        </w:rPr>
-        <w:t xml:space="preserve">在全并行更新下因振荡而失效、需要补救措施，原稿的表述与其论点相反。更正后的表述已写入表</w:t>
-      </w:r>
-      <w:r>
-        <w:t xml:space="preserve">3.3</w:t>
-      </w:r>
-      <w:r>
-        <w:rPr>
-          <w:rFonts w:hint="eastAsia"/>
-        </w:rPr>
-        <w:t xml:space="preserve">与相应正文，并说明本文采用严格异步更新、未出现该失效模式。</w:t>
+        <w:t>在整理对照表的过程中，核对文献原文发现原稿两处引用数值有误，一并更正。其一，原稿称</w:t>
+      </w:r>
+      <w:r>
+        <w:t>BLS</w:t>
+      </w:r>
+      <w:r>
+        <w:rPr>
+          <w:rFonts w:hint="eastAsia"/>
+        </w:rPr>
+        <w:t>在</w:t>
+      </w:r>
+      <w:r>
+        <w:t>G1</w:t>
+      </w:r>
+      <w:r>
+        <w:rPr>
+          <w:rFonts w:hint="eastAsia"/>
+        </w:rPr>
+        <w:t>上约</w:t>
+      </w:r>
+      <w:r>
+        <w:t>2</w:t>
+      </w:r>
+      <w:r>
+        <w:rPr>
+          <w:rFonts w:hint="eastAsia"/>
+        </w:rPr>
+        <w:t>至</w:t>
+      </w:r>
+      <w:r>
+        <w:t>3</w:t>
+      </w:r>
+      <w:r>
+        <w:rPr>
+          <w:rFonts w:hint="eastAsia"/>
+        </w:rPr>
+        <w:t>秒达到最好解，核对该文表</w:t>
+      </w:r>
+      <w:r>
+        <w:t>2</w:t>
+      </w:r>
+      <w:r>
+        <w:rPr>
+          <w:rFonts w:hint="eastAsia"/>
+        </w:rPr>
+        <w:t>，</w:t>
+      </w:r>
+      <w:r>
+        <w:t>G1</w:t>
+      </w:r>
+      <w:r>
+        <w:rPr>
+          <w:rFonts w:hint="eastAsia"/>
+        </w:rPr>
+        <w:t>的平均用时为</w:t>
+      </w:r>
+      <w:r>
+        <w:t>13</w:t>
+      </w:r>
+      <w:r>
+        <w:rPr>
+          <w:rFonts w:hint="eastAsia"/>
+        </w:rPr>
+        <w:t>秒，</w:t>
+      </w:r>
+      <w:r>
+        <w:t>2</w:t>
+      </w:r>
+      <w:r>
+        <w:rPr>
+          <w:rFonts w:hint="eastAsia"/>
+        </w:rPr>
+        <w:t>至</w:t>
+      </w:r>
+      <w:r>
+        <w:t>3</w:t>
+      </w:r>
+      <w:r>
+        <w:rPr>
+          <w:rFonts w:hint="eastAsia"/>
+        </w:rPr>
+        <w:t>秒对应的是同表中</w:t>
+      </w:r>
+      <w:r>
+        <w:t>G11</w:t>
+      </w:r>
+      <w:r>
+        <w:rPr>
+          <w:rFonts w:hint="eastAsia"/>
+        </w:rPr>
+        <w:t>至</w:t>
+      </w:r>
+      <w:r>
+        <w:t>G13</w:t>
+      </w:r>
+      <w:r>
+        <w:rPr>
+          <w:rFonts w:hint="eastAsia"/>
+        </w:rPr>
+        <w:t>三个实例。其二，原稿称</w:t>
+      </w:r>
+      <w:r>
+        <w:t>pSA</w:t>
+      </w:r>
+      <w:r>
+        <w:rPr>
+          <w:rFonts w:hint="eastAsia"/>
+        </w:rPr>
+        <w:t>在</w:t>
+      </w:r>
+      <w:r>
+        <w:t>G1</w:t>
+      </w:r>
+      <w:r>
+        <w:rPr>
+          <w:rFonts w:hint="eastAsia"/>
+        </w:rPr>
+        <w:t>上的归一化切分均值为</w:t>
+      </w:r>
+      <w:r>
+        <w:t>0.996</w:t>
+      </w:r>
+      <w:r>
+        <w:rPr>
+          <w:rFonts w:hint="eastAsia"/>
+        </w:rPr>
+        <w:t>至</w:t>
+      </w:r>
+      <w:r>
+        <w:t>0.998</w:t>
+      </w:r>
+      <w:r>
+        <w:rPr>
+          <w:rFonts w:hint="eastAsia"/>
+        </w:rPr>
+        <w:t>、其改进型达到</w:t>
+      </w:r>
+      <w:r>
+        <w:t>0.999</w:t>
+      </w:r>
+      <w:r>
+        <w:rPr>
+          <w:rFonts w:hint="eastAsia"/>
+        </w:rPr>
+        <w:t>以上，核对该文表</w:t>
+      </w:r>
+      <w:r>
+        <w:t>5</w:t>
+      </w:r>
+      <w:r>
+        <w:rPr>
+          <w:rFonts w:hint="eastAsia"/>
+        </w:rPr>
+        <w:t>与表</w:t>
+      </w:r>
+      <w:r>
+        <w:t>6</w:t>
+      </w:r>
+      <w:r>
+        <w:rPr>
+          <w:rFonts w:hint="eastAsia"/>
+        </w:rPr>
+        <w:t>，</w:t>
+      </w:r>
+      <w:r>
+        <w:t>pSA</w:t>
+      </w:r>
+      <w:r>
+        <w:rPr>
+          <w:rFonts w:hint="eastAsia"/>
+        </w:rPr>
+        <w:t>在</w:t>
+      </w:r>
+      <w:r>
+        <w:t>G1</w:t>
+      </w:r>
+      <w:r>
+        <w:rPr>
+          <w:rFonts w:hint="eastAsia"/>
+        </w:rPr>
+        <w:t>、</w:t>
+      </w:r>
+      <w:r>
+        <w:t>G14</w:t>
+      </w:r>
+      <w:r>
+        <w:rPr>
+          <w:rFonts w:hint="eastAsia"/>
+        </w:rPr>
+        <w:t>、</w:t>
+      </w:r>
+      <w:r>
+        <w:t>G22</w:t>
+      </w:r>
+      <w:r>
+        <w:rPr>
+          <w:rFonts w:hint="eastAsia"/>
+        </w:rPr>
+        <w:t>三个全正权实例上的切分均值均为零，其改进型</w:t>
+      </w:r>
+      <w:r>
+        <w:t>TApSA</w:t>
+      </w:r>
+      <w:r>
+        <w:rPr>
+          <w:rFonts w:hint="eastAsia"/>
+        </w:rPr>
+        <w:t>的归一化切分为</w:t>
+      </w:r>
+      <w:r>
+        <w:t>0.996</w:t>
+      </w:r>
+      <w:r>
+        <w:rPr>
+          <w:rFonts w:hint="eastAsia"/>
+        </w:rPr>
+        <w:t>、</w:t>
+      </w:r>
+      <w:r>
+        <w:t>0.991</w:t>
+      </w:r>
+      <w:r>
+        <w:rPr>
+          <w:rFonts w:hint="eastAsia"/>
+        </w:rPr>
+        <w:t>与</w:t>
+      </w:r>
+      <w:r>
+        <w:t>0.994</w:t>
+      </w:r>
+      <w:r>
+        <w:rPr>
+          <w:rFonts w:hint="eastAsia"/>
+        </w:rPr>
+        <w:t>，全文没有</w:t>
+      </w:r>
+      <w:r>
+        <w:t>0.999</w:t>
+      </w:r>
+      <w:r>
+        <w:rPr>
+          <w:rFonts w:hint="eastAsia"/>
+        </w:rPr>
+        <w:t>以上的取值。该文的论点正是常规</w:t>
+      </w:r>
+      <w:r>
+        <w:t>pSA</w:t>
+      </w:r>
+      <w:r>
+        <w:rPr>
+          <w:rFonts w:hint="eastAsia"/>
+        </w:rPr>
+        <w:t>在全并行更新下因振荡而失效、需要补救措施，原稿的表述与其论点相反。更正后的表述已写入表</w:t>
+      </w:r>
+      <w:r>
+        <w:t>3.3</w:t>
+      </w:r>
+      <w:r>
+        <w:rPr>
+          <w:rFonts w:hint="eastAsia"/>
+        </w:rPr>
+        <w:t>与相应正文，并说明本文采用严格异步更新、未出现该失效模式。</w:t>
       </w:r>
     </w:p>
     <w:p>
@@ -983,79 +983,81 @@
         <w:rPr>
           <w:rFonts w:hint="eastAsia"/>
         </w:rPr>
-        <w:t xml:space="preserve">核对基准实例文件时另发现一处描述性错误：原稿把</w:t>
-      </w:r>
-      <w:r>
-        <w:t xml:space="preserve">G14</w:t>
-      </w:r>
-      <w:r>
-        <w:rPr>
-          <w:rFonts w:hint="eastAsia"/>
-        </w:rPr>
-        <w:t xml:space="preserve">称为稀疏符号混合图，而</w:t>
-      </w:r>
-      <w:r>
-        <w:t xml:space="preserve">G-set</w:t>
-      </w:r>
-      <w:r>
-        <w:rPr>
-          <w:rFonts w:hint="eastAsia"/>
-        </w:rPr>
-        <w:t xml:space="preserve">公布的</w:t>
-      </w:r>
-      <w:r>
-        <w:t xml:space="preserve">G14</w:t>
-      </w:r>
-      <w:r>
-        <w:rPr>
-          <w:rFonts w:hint="eastAsia"/>
-        </w:rPr>
-        <w:t xml:space="preserve">全部</w:t>
-      </w:r>
-      <w:r>
-        <w:t xml:space="preserve">4694</w:t>
-      </w:r>
-      <w:r>
-        <w:rPr>
-          <w:rFonts w:hint="eastAsia"/>
-        </w:rPr>
-        <w:t xml:space="preserve">条边权值均为</w:t>
-      </w:r>
-      <w:r>
-        <w:t xml:space="preserve">$+1$</w:t>
-      </w:r>
-      <w:r>
-        <w:rPr>
-          <w:rFonts w:hint="eastAsia"/>
-        </w:rPr>
-        <w:t xml:space="preserve">，符号混合的是同一拓扑族的</w:t>
-      </w:r>
-      <w:r>
-        <w:t xml:space="preserve">G18</w:t>
-      </w:r>
-      <w:r>
-        <w:rPr>
-          <w:rFonts w:hint="eastAsia"/>
-        </w:rPr>
-        <w:t xml:space="preserve">至</w:t>
-      </w:r>
-      <w:r>
-        <w:t xml:space="preserve">G21</w:t>
-      </w:r>
-      <w:r>
-        <w:rPr>
-          <w:rFonts w:hint="eastAsia"/>
-        </w:rPr>
-        <w:t xml:space="preserve">。已将</w:t>
-      </w:r>
-      <w:r>
-        <w:t xml:space="preserve">G14</w:t>
-      </w:r>
-      <w:r>
-        <w:rPr>
-          <w:rFonts w:hint="eastAsia"/>
-        </w:rPr>
-        <w:t xml:space="preserve">的描述改为稀疏正权图，其浅局部极小的成因相应改由稀疏低度结构</w:t>
+        <w:t>核对基准实例文件时另发现一处描述性错误：原稿把</w:t>
+      </w:r>
+      <w:r>
+        <w:t>G14</w:t>
+      </w:r>
+      <w:r>
+        <w:rPr>
+          <w:rFonts w:hint="eastAsia"/>
+        </w:rPr>
+        <w:t>称为稀疏符号混合图，而</w:t>
+      </w:r>
+      <w:r>
+        <w:t>G-set</w:t>
+      </w:r>
+      <w:r>
+        <w:rPr>
+          <w:rFonts w:hint="eastAsia"/>
+        </w:rPr>
+        <w:t>公布的</w:t>
+      </w:r>
+      <w:r>
+        <w:t>G14</w:t>
+      </w:r>
+      <w:r>
+        <w:rPr>
+          <w:rFonts w:hint="eastAsia"/>
+        </w:rPr>
+        <w:t>全部</w:t>
+      </w:r>
+      <w:r>
+        <w:t>4694</w:t>
+      </w:r>
+      <w:r>
+        <w:rPr>
+          <w:rFonts w:hint="eastAsia"/>
+        </w:rPr>
+        <w:t>条边权值均为</w:t>
+      </w:r>
+      <w:r>
+        <w:t>+1</w:t>
+      </w:r>
+      <w:bookmarkStart w:id="0" w:name="_GoBack"/>
+      <w:bookmarkEnd w:id="0"/>
+      <w:r>
+        <w:rPr>
+          <w:rFonts w:hint="eastAsia"/>
+        </w:rPr>
+        <w:t>，符号混合的是同一拓扑族的</w:t>
+      </w:r>
+      <w:r>
+        <w:t>G18</w:t>
+      </w:r>
+      <w:r>
+        <w:rPr>
+          <w:rFonts w:hint="eastAsia"/>
+        </w:rPr>
+        <w:t>至</w:t>
+      </w:r>
+      <w:r>
+        <w:t>G21</w:t>
+      </w:r>
+      <w:r>
+        <w:rPr>
+          <w:rFonts w:hint="eastAsia"/>
+        </w:rPr>
+        <w:t>。已将</w:t>
+      </w:r>
+      <w:r>
+        <w:t>G14</w:t>
+      </w:r>
+      <w:r>
+        <w:rPr>
+          <w:rFonts w:hint="eastAsia"/>
+        </w:rPr>
+        <w:t>的描述改为稀疏正权图，其浅局部极小的成因相应改由稀疏低度结构</w:t>
       </w:r>
       <w:r>
         <w:t xml:space="preserve"> (</w:t>
@@ -1064,25 +1066,25 @@
         <w:rPr>
           <w:rFonts w:hint="eastAsia"/>
         </w:rPr>
-        <w:t xml:space="preserve">平均度</w:t>
-      </w:r>
-      <w:r>
-        <w:t xml:space="preserve">11.7</w:t>
-      </w:r>
-      <w:r>
-        <w:rPr>
-          <w:rFonts w:hint="eastAsia"/>
-        </w:rPr>
-        <w:t xml:space="preserve">，</w:t>
-      </w:r>
-      <w:r>
-        <w:t xml:space="preserve">G1</w:t>
-      </w:r>
-      <w:r>
-        <w:rPr>
-          <w:rFonts w:hint="eastAsia"/>
-        </w:rPr>
-        <w:t xml:space="preserve">为</w:t>
+        <w:t>平均度</w:t>
+      </w:r>
+      <w:r>
+        <w:t>11.7</w:t>
+      </w:r>
+      <w:r>
+        <w:rPr>
+          <w:rFonts w:hint="eastAsia"/>
+        </w:rPr>
+        <w:t>，</w:t>
+      </w:r>
+      <w:r>
+        <w:t>G1</w:t>
+      </w:r>
+      <w:r>
+        <w:rPr>
+          <w:rFonts w:hint="eastAsia"/>
+        </w:rPr>
+        <w:t>为</w:t>
       </w:r>
       <w:r>
         <w:t xml:space="preserve">47.9) </w:t>
@@ -1091,34 +1093,34 @@
         <w:rPr>
           <w:rFonts w:hint="eastAsia"/>
         </w:rPr>
-        <w:t xml:space="preserve">说明，涉及</w:t>
-      </w:r>
-      <w:r>
-        <w:t xml:space="preserve">3.3.1</w:t>
-      </w:r>
-      <w:r>
-        <w:rPr>
-          <w:rFonts w:hint="eastAsia"/>
-        </w:rPr>
-        <w:t xml:space="preserve">、</w:t>
-      </w:r>
-      <w:r>
-        <w:t xml:space="preserve">3.3.3</w:t>
-      </w:r>
-      <w:r>
-        <w:rPr>
-          <w:rFonts w:hint="eastAsia"/>
-        </w:rPr>
-        <w:t xml:space="preserve">与</w:t>
-      </w:r>
-      <w:r>
-        <w:t xml:space="preserve">3.5.2</w:t>
-      </w:r>
-      <w:r>
-        <w:rPr>
-          <w:rFonts w:hint="eastAsia"/>
-        </w:rPr>
-        <w:t xml:space="preserve">各节的相关表述。</w:t>
+        <w:t>说明，涉及</w:t>
+      </w:r>
+      <w:r>
+        <w:t>3.3.1</w:t>
+      </w:r>
+      <w:r>
+        <w:rPr>
+          <w:rFonts w:hint="eastAsia"/>
+        </w:rPr>
+        <w:t>、</w:t>
+      </w:r>
+      <w:r>
+        <w:t>3.3.3</w:t>
+      </w:r>
+      <w:r>
+        <w:rPr>
+          <w:rFonts w:hint="eastAsia"/>
+        </w:rPr>
+        <w:t>与</w:t>
+      </w:r>
+      <w:r>
+        <w:t>3.5.2</w:t>
+      </w:r>
+      <w:r>
+        <w:rPr>
+          <w:rFonts w:hint="eastAsia"/>
+        </w:rPr>
+        <w:t>各节的相关表述。</w:t>
       </w:r>
     </w:p>
     <w:p>
@@ -1144,25 +1146,25 @@
         <w:rPr>
           <w:rFonts w:hint="eastAsia"/>
         </w:rPr>
-        <w:t xml:space="preserve">修改位置。第</w:t>
-      </w:r>
-      <w:r>
-        <w:t xml:space="preserve">3</w:t>
-      </w:r>
-      <w:r>
-        <w:rPr>
-          <w:rFonts w:hint="eastAsia"/>
-        </w:rPr>
-        <w:t xml:space="preserve">章</w:t>
-      </w:r>
-      <w:r>
-        <w:t xml:space="preserve">3.3.1</w:t>
-      </w:r>
-      <w:r>
-        <w:rPr>
-          <w:rFonts w:hint="eastAsia"/>
-        </w:rPr>
-        <w:t xml:space="preserve">节</w:t>
+        <w:t>修改位置。第</w:t>
+      </w:r>
+      <w:r>
+        <w:t>3</w:t>
+      </w:r>
+      <w:r>
+        <w:rPr>
+          <w:rFonts w:hint="eastAsia"/>
+        </w:rPr>
+        <w:t>章</w:t>
+      </w:r>
+      <w:r>
+        <w:t>3.3.1</w:t>
+      </w:r>
+      <w:r>
+        <w:rPr>
+          <w:rFonts w:hint="eastAsia"/>
+        </w:rPr>
+        <w:t>节</w:t>
       </w:r>
       <w:r>
         <w:t xml:space="preserve"> (</w:t>
@@ -1171,34 +1173,34 @@
         <w:rPr>
           <w:rFonts w:hint="eastAsia"/>
         </w:rPr>
-        <w:t xml:space="preserve">表</w:t>
-      </w:r>
-      <w:r>
-        <w:t xml:space="preserve">3.3</w:t>
-      </w:r>
-      <w:r>
-        <w:rPr>
-          <w:rFonts w:hint="eastAsia"/>
-        </w:rPr>
-        <w:t xml:space="preserve">及其前后正文</w:t>
-      </w:r>
-      <w:r>
-        <w:t xml:space="preserve">)</w:t>
-      </w:r>
-      <w:r>
-        <w:rPr>
-          <w:rFonts w:hint="eastAsia"/>
-        </w:rPr>
-        <w:t xml:space="preserve">、</w:t>
-      </w:r>
-      <w:r>
-        <w:t xml:space="preserve">3.3.2</w:t>
-      </w:r>
-      <w:r>
-        <w:rPr>
-          <w:rFonts w:hint="eastAsia"/>
-        </w:rPr>
-        <w:t xml:space="preserve">节</w:t>
+        <w:t>表</w:t>
+      </w:r>
+      <w:r>
+        <w:t>3.3</w:t>
+      </w:r>
+      <w:r>
+        <w:rPr>
+          <w:rFonts w:hint="eastAsia"/>
+        </w:rPr>
+        <w:t>及其前后正文</w:t>
+      </w:r>
+      <w:r>
+        <w:t>)</w:t>
+      </w:r>
+      <w:r>
+        <w:rPr>
+          <w:rFonts w:hint="eastAsia"/>
+        </w:rPr>
+        <w:t>、</w:t>
+      </w:r>
+      <w:r>
+        <w:t>3.3.2</w:t>
+      </w:r>
+      <w:r>
+        <w:rPr>
+          <w:rFonts w:hint="eastAsia"/>
+        </w:rPr>
+        <w:t>节</w:t>
       </w:r>
       <w:r>
         <w:t xml:space="preserve"> (</w:t>
@@ -1207,34 +1209,34 @@
         <w:rPr>
           <w:rFonts w:hint="eastAsia"/>
         </w:rPr>
-        <w:t xml:space="preserve">表</w:t>
-      </w:r>
-      <w:r>
-        <w:t xml:space="preserve">3.6</w:t>
-      </w:r>
-      <w:r>
-        <w:rPr>
-          <w:rFonts w:hint="eastAsia"/>
-        </w:rPr>
-        <w:t xml:space="preserve">及其前后正文</w:t>
-      </w:r>
-      <w:r>
-        <w:t xml:space="preserve">)</w:t>
-      </w:r>
-      <w:r>
-        <w:rPr>
-          <w:rFonts w:hint="eastAsia"/>
-        </w:rPr>
-        <w:t xml:space="preserve">、</w:t>
-      </w:r>
-      <w:r>
-        <w:t xml:space="preserve">3.3.3</w:t>
-      </w:r>
-      <w:r>
-        <w:rPr>
-          <w:rFonts w:hint="eastAsia"/>
-        </w:rPr>
-        <w:t xml:space="preserve">节</w:t>
+        <w:t>表</w:t>
+      </w:r>
+      <w:r>
+        <w:t>3.6</w:t>
+      </w:r>
+      <w:r>
+        <w:rPr>
+          <w:rFonts w:hint="eastAsia"/>
+        </w:rPr>
+        <w:t>及其前后正文</w:t>
+      </w:r>
+      <w:r>
+        <w:t>)</w:t>
+      </w:r>
+      <w:r>
+        <w:rPr>
+          <w:rFonts w:hint="eastAsia"/>
+        </w:rPr>
+        <w:t>、</w:t>
+      </w:r>
+      <w:r>
+        <w:t>3.3.3</w:t>
+      </w:r>
+      <w:r>
+        <w:rPr>
+          <w:rFonts w:hint="eastAsia"/>
+        </w:rPr>
+        <w:t>节</w:t>
       </w:r>
       <w:r>
         <w:t xml:space="preserve"> (</w:t>
@@ -1243,43 +1245,43 @@
         <w:rPr>
           <w:rFonts w:hint="eastAsia"/>
         </w:rPr>
-        <w:t xml:space="preserve">表</w:t>
-      </w:r>
-      <w:r>
-        <w:t xml:space="preserve">3.9</w:t>
-      </w:r>
-      <w:r>
-        <w:rPr>
-          <w:rFonts w:hint="eastAsia"/>
-        </w:rPr>
-        <w:t xml:space="preserve">及其前后正文</w:t>
-      </w:r>
-      <w:r>
-        <w:t xml:space="preserve">)</w:t>
-      </w:r>
-      <w:r>
-        <w:rPr>
-          <w:rFonts w:hint="eastAsia"/>
-        </w:rPr>
-        <w:t xml:space="preserve">；表</w:t>
-      </w:r>
-      <w:r>
-        <w:t xml:space="preserve">3.4</w:t>
-      </w:r>
-      <w:r>
-        <w:rPr>
-          <w:rFonts w:hint="eastAsia"/>
-        </w:rPr>
-        <w:t xml:space="preserve">至表</w:t>
-      </w:r>
-      <w:r>
-        <w:t xml:space="preserve">3.12</w:t>
-      </w:r>
-      <w:r>
-        <w:rPr>
-          <w:rFonts w:hint="eastAsia"/>
-        </w:rPr>
-        <w:t xml:space="preserve">的编号与正文引用同步更新。</w:t>
+        <w:t>表</w:t>
+      </w:r>
+      <w:r>
+        <w:t>3.9</w:t>
+      </w:r>
+      <w:r>
+        <w:rPr>
+          <w:rFonts w:hint="eastAsia"/>
+        </w:rPr>
+        <w:t>及其前后正文</w:t>
+      </w:r>
+      <w:r>
+        <w:t>)</w:t>
+      </w:r>
+      <w:r>
+        <w:rPr>
+          <w:rFonts w:hint="eastAsia"/>
+        </w:rPr>
+        <w:t>；表</w:t>
+      </w:r>
+      <w:r>
+        <w:t>3.4</w:t>
+      </w:r>
+      <w:r>
+        <w:rPr>
+          <w:rFonts w:hint="eastAsia"/>
+        </w:rPr>
+        <w:t>至表</w:t>
+      </w:r>
+      <w:r>
+        <w:t>3.12</w:t>
+      </w:r>
+      <w:r>
+        <w:rPr>
+          <w:rFonts w:hint="eastAsia"/>
+        </w:rPr>
+        <w:t>的编号与正文引用同步更新。</w:t>
       </w:r>
     </w:p>
     <w:p>
@@ -1291,7 +1293,7 @@
         <w:rPr>
           <w:rFonts w:hint="eastAsia"/>
         </w:rPr>
-        <w:t xml:space="preserve">意见二：方法与参考文献的关系不清晰，正文未标注方法出处</w:t>
+        <w:t>意见二：方法与参考文献的关系不清晰，正文未标注方法出处</w:t>
       </w:r>
     </w:p>
     <w:p>
@@ -1317,16 +1319,16 @@
         <w:rPr>
           <w:rFonts w:hint="eastAsia"/>
         </w:rPr>
-        <w:t xml:space="preserve">修改说明。原稿把该领域的公有方法当作常识使用，只在概念首次出现时给出综述性引文，未在每个方法组件的使用处标注原始出处。现已逐处补引，新增十条文献，每条都落在该方法实际被使用的位置，并在章末参考文献表按首次引用顺序登记，全部给出</w:t>
-      </w:r>
-      <w:r>
-        <w:t xml:space="preserve">DOI</w:t>
-      </w:r>
-      <w:r>
-        <w:rPr>
-          <w:rFonts w:hint="eastAsia"/>
-        </w:rPr>
-        <w:t xml:space="preserve">。补引位置如下表。</w:t>
+        <w:t>修改说明。原稿把该领域的公有方法当作常识使用，只在概念首次出现时给出综述性引文，未在每个方法组件的使用处标注原始出处。现已逐处补引，新增十条文献，每条都落在该方法实际被使用的位置，并在章末参考文献表按首次引用顺序登记，全部给出</w:t>
+      </w:r>
+      <w:r>
+        <w:t>DOI</w:t>
+      </w:r>
+      <w:r>
+        <w:rPr>
+          <w:rFonts w:hint="eastAsia"/>
+        </w:rPr>
+        <w:t>。补引位置如下表。</w:t>
       </w:r>
     </w:p>
     <w:tbl>
@@ -1348,6 +1350,14 @@
         <w:gridCol w:w="3856"/>
       </w:tblGrid>
       <w:tr>
+        <w:tblPrEx>
+          <w:tblCellMar>
+            <w:top w:w="0" w:type="dxa"/>
+            <w:left w:w="108" w:type="dxa"/>
+            <w:bottom w:w="0" w:type="dxa"/>
+            <w:right w:w="108" w:type="dxa"/>
+          </w:tblCellMar>
+        </w:tblPrEx>
         <w:trPr>
           <w:trHeight w:val="0" w:hRule="atLeast"/>
           <w:tblHeader/>
@@ -1391,7 +1401,7 @@
                 <w:rFonts w:hint="eastAsia"/>
                 <w:b/>
               </w:rPr>
-              <w:t xml:space="preserve">方法组件</w:t>
+              <w:t>方法组件</w:t>
             </w:r>
           </w:p>
         </w:tc>
@@ -1433,7 +1443,7 @@
                 <w:rFonts w:hint="eastAsia"/>
                 <w:b/>
               </w:rPr>
-              <w:t xml:space="preserve">补引位置</w:t>
+              <w:t>补引位置</w:t>
             </w:r>
           </w:p>
         </w:tc>
@@ -1475,12 +1485,20 @@
                 <w:rFonts w:hint="eastAsia"/>
                 <w:b/>
               </w:rPr>
-              <w:t xml:space="preserve">文献</w:t>
+              <w:t>文献</w:t>
             </w:r>
           </w:p>
         </w:tc>
       </w:tr>
       <w:tr>
+        <w:tblPrEx>
+          <w:tblCellMar>
+            <w:top w:w="0" w:type="dxa"/>
+            <w:left w:w="108" w:type="dxa"/>
+            <w:bottom w:w="0" w:type="dxa"/>
+            <w:right w:w="108" w:type="dxa"/>
+          </w:tblCellMar>
+        </w:tblPrEx>
         <w:trPr>
           <w:trHeight w:val="0" w:hRule="atLeast"/>
           <w:jc w:val="center"/>
@@ -1516,13 +1534,13 @@
               <w:jc w:val="left"/>
             </w:pPr>
             <w:r>
-              <w:t xml:space="preserve">Gibbs</w:t>
+              <w:t>Gibbs</w:t>
             </w:r>
             <w:r>
               <w:rPr>
                 <w:rFonts w:hint="eastAsia"/>
               </w:rPr>
-              <w:t xml:space="preserve">热浴单自旋动力学</w:t>
+              <w:t>热浴单自旋动力学</w:t>
             </w:r>
           </w:p>
         </w:tc>
@@ -1557,13 +1575,13 @@
               <w:jc w:val="left"/>
             </w:pPr>
             <w:r>
-              <w:t xml:space="preserve">3.1.1</w:t>
+              <w:t>3.1.1</w:t>
             </w:r>
             <w:r>
               <w:rPr>
                 <w:rFonts w:hint="eastAsia"/>
               </w:rPr>
-              <w:t xml:space="preserve">节，条件概率采样式</w:t>
+              <w:t>节，条件概率采样式</w:t>
             </w:r>
           </w:p>
         </w:tc>
@@ -1598,30 +1616,38 @@
               <w:jc w:val="left"/>
             </w:pPr>
             <w:r>
-              <w:t xml:space="preserve">Glauber 1963</w:t>
+              <w:t>Glauber 1963</w:t>
             </w:r>
             <w:r>
               <w:rPr>
                 <w:rFonts w:hint="eastAsia"/>
               </w:rPr>
-              <w:t xml:space="preserve">；</w:t>
+              <w:t>；</w:t>
             </w:r>
             <w:r>
-              <w:t xml:space="preserve">Geman</w:t>
+              <w:t>Geman</w:t>
             </w:r>
             <w:r>
               <w:rPr>
                 <w:rFonts w:hint="eastAsia"/>
               </w:rPr>
-              <w:t xml:space="preserve">与</w:t>
+              <w:t>与</w:t>
             </w:r>
             <w:r>
-              <w:t xml:space="preserve">Geman 1984</w:t>
+              <w:t>Geman 1984</w:t>
             </w:r>
           </w:p>
         </w:tc>
       </w:tr>
       <w:tr>
+        <w:tblPrEx>
+          <w:tblCellMar>
+            <w:top w:w="0" w:type="dxa"/>
+            <w:left w:w="108" w:type="dxa"/>
+            <w:bottom w:w="0" w:type="dxa"/>
+            <w:right w:w="108" w:type="dxa"/>
+          </w:tblCellMar>
+        </w:tblPrEx>
         <w:trPr>
           <w:trHeight w:val="0" w:hRule="atLeast"/>
           <w:jc w:val="center"/>
@@ -1657,13 +1683,13 @@
               <w:jc w:val="left"/>
             </w:pPr>
             <w:r>
-              <w:t xml:space="preserve">p-bit</w:t>
+              <w:t>p-bit</w:t>
             </w:r>
             <w:r>
               <w:rPr>
                 <w:rFonts w:hint="eastAsia"/>
               </w:rPr>
-              <w:t xml:space="preserve">形式化</w:t>
+              <w:t>形式化</w:t>
             </w:r>
           </w:p>
         </w:tc>
@@ -1698,22 +1724,22 @@
               <w:jc w:val="left"/>
             </w:pPr>
             <w:r>
-              <w:t xml:space="preserve">3.1.1</w:t>
+              <w:t>3.1.1</w:t>
             </w:r>
             <w:r>
               <w:rPr>
                 <w:rFonts w:hint="eastAsia"/>
               </w:rPr>
-              <w:t xml:space="preserve">节，</w:t>
+              <w:t>节，</w:t>
             </w:r>
             <w:r>
-              <w:t xml:space="preserve">sMTJ</w:t>
+              <w:t>sMTJ</w:t>
             </w:r>
             <w:r>
               <w:rPr>
                 <w:rFonts w:hint="eastAsia"/>
               </w:rPr>
-              <w:t xml:space="preserve">充当伊辛自旋处</w:t>
+              <w:t>充当伊辛自旋处</w:t>
             </w:r>
           </w:p>
         </w:tc>
@@ -1748,13 +1774,13 @@
               <w:jc w:val="left"/>
             </w:pPr>
             <w:r>
-              <w:t xml:space="preserve">Camsari</w:t>
+              <w:t>Camsari</w:t>
             </w:r>
             <w:r>
               <w:rPr>
                 <w:rFonts w:hint="eastAsia"/>
               </w:rPr>
-              <w:t xml:space="preserve">等</w:t>
+              <w:t>等</w:t>
             </w:r>
             <w:r>
               <w:t xml:space="preserve"> 2017</w:t>
@@ -1763,6 +1789,14 @@
         </w:tc>
       </w:tr>
       <w:tr>
+        <w:tblPrEx>
+          <w:tblCellMar>
+            <w:top w:w="0" w:type="dxa"/>
+            <w:left w:w="108" w:type="dxa"/>
+            <w:bottom w:w="0" w:type="dxa"/>
+            <w:right w:w="108" w:type="dxa"/>
+          </w:tblCellMar>
+        </w:tblPrEx>
         <w:trPr>
           <w:trHeight w:val="0" w:hRule="atLeast"/>
           <w:jc w:val="center"/>
@@ -1801,10 +1835,10 @@
               <w:rPr>
                 <w:rFonts w:hint="eastAsia"/>
               </w:rPr>
-              <w:t xml:space="preserve">求解时间指标</w:t>
+              <w:t>求解时间指标</w:t>
             </w:r>
             <w:r>
-              <w:t xml:space="preserve">TTS_99</w:t>
+              <w:t>TTS_99</w:t>
             </w:r>
           </w:p>
         </w:tc>
@@ -1839,13 +1873,13 @@
               <w:jc w:val="left"/>
             </w:pPr>
             <w:r>
-              <w:t xml:space="preserve">3.3</w:t>
+              <w:t>3.3</w:t>
             </w:r>
             <w:r>
               <w:rPr>
                 <w:rFonts w:hint="eastAsia"/>
               </w:rPr>
-              <w:t xml:space="preserve">节，评估指标定义式</w:t>
+              <w:t>节，评估指标定义式</w:t>
             </w:r>
           </w:p>
         </w:tc>
@@ -1880,13 +1914,13 @@
               <w:jc w:val="left"/>
             </w:pPr>
             <w:r>
-              <w:t xml:space="preserve">Rønnow</w:t>
+              <w:t>Rønnow</w:t>
             </w:r>
             <w:r>
               <w:rPr>
                 <w:rFonts w:hint="eastAsia"/>
               </w:rPr>
-              <w:t xml:space="preserve">等</w:t>
+              <w:t>等</w:t>
             </w:r>
             <w:r>
               <w:t xml:space="preserve"> 2014</w:t>
@@ -1895,6 +1929,14 @@
         </w:tc>
       </w:tr>
       <w:tr>
+        <w:tblPrEx>
+          <w:tblCellMar>
+            <w:top w:w="0" w:type="dxa"/>
+            <w:left w:w="108" w:type="dxa"/>
+            <w:bottom w:w="0" w:type="dxa"/>
+            <w:right w:w="108" w:type="dxa"/>
+          </w:tblCellMar>
+        </w:tblPrEx>
         <w:trPr>
           <w:trHeight w:val="0" w:hRule="atLeast"/>
           <w:jc w:val="center"/>
@@ -1930,13 +1972,13 @@
               <w:jc w:val="left"/>
             </w:pPr>
             <w:r>
-              <w:t xml:space="preserve">Wilson</w:t>
+              <w:t>Wilson</w:t>
             </w:r>
             <w:r>
               <w:rPr>
                 <w:rFonts w:hint="eastAsia"/>
               </w:rPr>
-              <w:t xml:space="preserve">置信区间</w:t>
+              <w:t>置信区间</w:t>
             </w:r>
           </w:p>
         </w:tc>
@@ -1971,13 +2013,13 @@
               <w:jc w:val="left"/>
             </w:pPr>
             <w:r>
-              <w:t xml:space="preserve">3.3</w:t>
+              <w:t>3.3</w:t>
             </w:r>
             <w:r>
               <w:rPr>
                 <w:rFonts w:hint="eastAsia"/>
               </w:rPr>
-              <w:t xml:space="preserve">节，统计约定</w:t>
+              <w:t>节，统计约定</w:t>
             </w:r>
           </w:p>
         </w:tc>
@@ -2012,12 +2054,20 @@
               <w:jc w:val="left"/>
             </w:pPr>
             <w:r>
-              <w:t xml:space="preserve">Wilson 1927</w:t>
+              <w:t>Wilson 1927</w:t>
             </w:r>
           </w:p>
         </w:tc>
       </w:tr>
       <w:tr>
+        <w:tblPrEx>
+          <w:tblCellMar>
+            <w:top w:w="0" w:type="dxa"/>
+            <w:left w:w="108" w:type="dxa"/>
+            <w:bottom w:w="0" w:type="dxa"/>
+            <w:right w:w="108" w:type="dxa"/>
+          </w:tblCellMar>
+        </w:tblPrEx>
         <w:trPr>
           <w:trHeight w:val="0" w:hRule="atLeast"/>
           <w:jc w:val="center"/>
@@ -2053,13 +2103,13 @@
               <w:jc w:val="left"/>
             </w:pPr>
             <w:r>
-              <w:t xml:space="preserve">Metropolis</w:t>
+              <w:t>Metropolis</w:t>
             </w:r>
             <w:r>
               <w:rPr>
                 <w:rFonts w:hint="eastAsia"/>
               </w:rPr>
-              <w:t xml:space="preserve">接受准则</w:t>
+              <w:t>接受准则</w:t>
             </w:r>
           </w:p>
         </w:tc>
@@ -2094,13 +2144,13 @@
               <w:jc w:val="left"/>
             </w:pPr>
             <w:r>
-              <w:t xml:space="preserve">3.3.1</w:t>
+              <w:t>3.3.1</w:t>
             </w:r>
             <w:r>
               <w:rPr>
                 <w:rFonts w:hint="eastAsia"/>
               </w:rPr>
-              <w:t xml:space="preserve">节，经典模拟退火对照</w:t>
+              <w:t>节，经典模拟退火对照</w:t>
             </w:r>
           </w:p>
         </w:tc>
@@ -2135,13 +2185,13 @@
               <w:jc w:val="left"/>
             </w:pPr>
             <w:r>
-              <w:t xml:space="preserve">Metropolis</w:t>
+              <w:t>Metropolis</w:t>
             </w:r>
             <w:r>
               <w:rPr>
                 <w:rFonts w:hint="eastAsia"/>
               </w:rPr>
-              <w:t xml:space="preserve">等</w:t>
+              <w:t>等</w:t>
             </w:r>
             <w:r>
               <w:t xml:space="preserve"> 1953</w:t>
@@ -2150,6 +2200,14 @@
         </w:tc>
       </w:tr>
       <w:tr>
+        <w:tblPrEx>
+          <w:tblCellMar>
+            <w:top w:w="0" w:type="dxa"/>
+            <w:left w:w="108" w:type="dxa"/>
+            <w:bottom w:w="0" w:type="dxa"/>
+            <w:right w:w="108" w:type="dxa"/>
+          </w:tblCellMar>
+        </w:tblPrEx>
         <w:trPr>
           <w:trHeight w:val="0" w:hRule="atLeast"/>
           <w:jc w:val="center"/>
@@ -2185,13 +2243,13 @@
               <w:jc w:val="left"/>
             </w:pPr>
             <w:r>
-              <w:t xml:space="preserve">2-opt</w:t>
+              <w:t>2-opt</w:t>
             </w:r>
             <w:r>
               <w:rPr>
                 <w:rFonts w:hint="eastAsia"/>
               </w:rPr>
-              <w:t xml:space="preserve">置换邻域</w:t>
+              <w:t>置换邻域</w:t>
             </w:r>
           </w:p>
         </w:tc>
@@ -2226,13 +2284,13 @@
               <w:jc w:val="left"/>
             </w:pPr>
             <w:r>
-              <w:t xml:space="preserve">3.3.3</w:t>
+              <w:t>3.3.3</w:t>
             </w:r>
             <w:r>
               <w:rPr>
                 <w:rFonts w:hint="eastAsia"/>
               </w:rPr>
-              <w:t xml:space="preserve">节，置换空间求解器</w:t>
+              <w:t>节，置换空间求解器</w:t>
             </w:r>
           </w:p>
         </w:tc>
@@ -2267,12 +2325,20 @@
               <w:jc w:val="left"/>
             </w:pPr>
             <w:r>
-              <w:t xml:space="preserve">Croes 1958</w:t>
+              <w:t>Croes 1958</w:t>
             </w:r>
           </w:p>
         </w:tc>
       </w:tr>
       <w:tr>
+        <w:tblPrEx>
+          <w:tblCellMar>
+            <w:top w:w="0" w:type="dxa"/>
+            <w:left w:w="108" w:type="dxa"/>
+            <w:bottom w:w="0" w:type="dxa"/>
+            <w:right w:w="108" w:type="dxa"/>
+          </w:tblCellMar>
+        </w:tblPrEx>
         <w:trPr>
           <w:trHeight w:val="0" w:hRule="atLeast"/>
           <w:jc w:val="center"/>
@@ -2308,13 +2374,13 @@
               <w:jc w:val="left"/>
             </w:pPr>
             <w:r>
-              <w:t xml:space="preserve">Lin-Kernighan</w:t>
+              <w:t>Lin-Kernighan</w:t>
             </w:r>
             <w:r>
               <w:rPr>
                 <w:rFonts w:hint="eastAsia"/>
               </w:rPr>
-              <w:t xml:space="preserve">置换邻域</w:t>
+              <w:t>置换邻域</w:t>
             </w:r>
           </w:p>
         </w:tc>
@@ -2349,13 +2415,13 @@
               <w:jc w:val="left"/>
             </w:pPr>
             <w:r>
-              <w:t xml:space="preserve">3.3.3</w:t>
+              <w:t>3.3.3</w:t>
             </w:r>
             <w:r>
               <w:rPr>
                 <w:rFonts w:hint="eastAsia"/>
               </w:rPr>
-              <w:t xml:space="preserve">节，置换空间求解器</w:t>
+              <w:t>节，置换空间求解器</w:t>
             </w:r>
           </w:p>
         </w:tc>
@@ -2390,21 +2456,29 @@
               <w:jc w:val="left"/>
             </w:pPr>
             <w:r>
-              <w:t xml:space="preserve">Lin</w:t>
+              <w:t>Lin</w:t>
             </w:r>
             <w:r>
               <w:rPr>
                 <w:rFonts w:hint="eastAsia"/>
               </w:rPr>
-              <w:t xml:space="preserve">与</w:t>
+              <w:t>与</w:t>
             </w:r>
             <w:r>
-              <w:t xml:space="preserve">Kernighan 1973</w:t>
+              <w:t>Kernighan 1973</w:t>
             </w:r>
           </w:p>
         </w:tc>
       </w:tr>
       <w:tr>
+        <w:tblPrEx>
+          <w:tblCellMar>
+            <w:top w:w="0" w:type="dxa"/>
+            <w:left w:w="108" w:type="dxa"/>
+            <w:bottom w:w="0" w:type="dxa"/>
+            <w:right w:w="108" w:type="dxa"/>
+          </w:tblCellMar>
+        </w:tblPrEx>
         <w:trPr>
           <w:trHeight w:val="0" w:hRule="atLeast"/>
           <w:jc w:val="center"/>
@@ -2440,13 +2514,13 @@
               <w:jc w:val="left"/>
             </w:pPr>
             <w:r>
-              <w:t xml:space="preserve">StrongARM</w:t>
+              <w:t>StrongARM</w:t>
             </w:r>
             <w:r>
               <w:rPr>
                 <w:rFonts w:hint="eastAsia"/>
               </w:rPr>
-              <w:t xml:space="preserve">锁存比较器</w:t>
+              <w:t>锁存比较器</w:t>
             </w:r>
           </w:p>
         </w:tc>
@@ -2481,13 +2555,13 @@
               <w:jc w:val="left"/>
             </w:pPr>
             <w:r>
-              <w:t xml:space="preserve">3.5.1</w:t>
+              <w:t>3.5.1</w:t>
             </w:r>
             <w:r>
               <w:rPr>
                 <w:rFonts w:hint="eastAsia"/>
               </w:rPr>
-              <w:t xml:space="preserve">节，读出通路</w:t>
+              <w:t>节，读出通路</w:t>
             </w:r>
           </w:p>
         </w:tc>
@@ -2522,12 +2596,20 @@
               <w:jc w:val="left"/>
             </w:pPr>
             <w:r>
-              <w:t xml:space="preserve">Razavi 2015</w:t>
+              <w:t>Razavi 2015</w:t>
             </w:r>
           </w:p>
         </w:tc>
       </w:tr>
       <w:tr>
+        <w:tblPrEx>
+          <w:tblCellMar>
+            <w:top w:w="0" w:type="dxa"/>
+            <w:left w:w="108" w:type="dxa"/>
+            <w:bottom w:w="0" w:type="dxa"/>
+            <w:right w:w="108" w:type="dxa"/>
+          </w:tblCellMar>
+        </w:tblPrEx>
         <w:trPr>
           <w:trHeight w:val="0" w:hRule="atLeast"/>
           <w:jc w:val="center"/>
@@ -2563,13 +2645,13 @@
               <w:jc w:val="left"/>
             </w:pPr>
             <w:r>
-              <w:t xml:space="preserve">MOS</w:t>
+              <w:t>MOS</w:t>
             </w:r>
             <w:r>
               <w:rPr>
                 <w:rFonts w:hint="eastAsia"/>
               </w:rPr>
-              <w:t xml:space="preserve">器件失配模型</w:t>
+              <w:t>器件失配模型</w:t>
             </w:r>
           </w:p>
         </w:tc>
@@ -2604,13 +2686,13 @@
               <w:jc w:val="left"/>
             </w:pPr>
             <w:r>
-              <w:t xml:space="preserve">3.5.5</w:t>
+              <w:t>3.5.5</w:t>
             </w:r>
             <w:r>
               <w:rPr>
                 <w:rFonts w:hint="eastAsia"/>
               </w:rPr>
-              <w:t xml:space="preserve">节，读出失配蒙特卡洛</w:t>
+              <w:t>节，读出失配蒙特卡洛</w:t>
             </w:r>
           </w:p>
         </w:tc>
@@ -2645,13 +2727,13 @@
               <w:jc w:val="left"/>
             </w:pPr>
             <w:r>
-              <w:t xml:space="preserve">Pelgrom</w:t>
+              <w:t>Pelgrom</w:t>
             </w:r>
             <w:r>
               <w:rPr>
                 <w:rFonts w:hint="eastAsia"/>
               </w:rPr>
-              <w:t xml:space="preserve">等</w:t>
+              <w:t>等</w:t>
             </w:r>
             <w:r>
               <w:t xml:space="preserve"> 1989</w:t>
@@ -2683,16 +2765,16 @@
         <w:rPr>
           <w:rFonts w:hint="eastAsia"/>
         </w:rPr>
-        <w:t xml:space="preserve">原已引用的</w:t>
-      </w:r>
-      <w:r>
-        <w:t xml:space="preserve">p-bit</w:t>
-      </w:r>
-      <w:r>
-        <w:rPr>
-          <w:rFonts w:hint="eastAsia"/>
-        </w:rPr>
-        <w:t xml:space="preserve">综述</w:t>
+        <w:t>原已引用的</w:t>
+      </w:r>
+      <w:r>
+        <w:t>p-bit</w:t>
+      </w:r>
+      <w:r>
+        <w:rPr>
+          <w:rFonts w:hint="eastAsia"/>
+        </w:rPr>
+        <w:t>综述</w:t>
       </w:r>
       <w:r>
         <w:t xml:space="preserve"> (Camsari</w:t>
@@ -2701,7 +2783,7 @@
         <w:rPr>
           <w:rFonts w:hint="eastAsia"/>
         </w:rPr>
-        <w:t xml:space="preserve">等</w:t>
+        <w:t>等</w:t>
       </w:r>
       <w:r>
         <w:t xml:space="preserve"> 2019) </w:t>
@@ -2710,16 +2792,16 @@
         <w:rPr>
           <w:rFonts w:hint="eastAsia"/>
         </w:rPr>
-        <w:t xml:space="preserve">此前只出现在硬件投影参数的出处，现已在</w:t>
-      </w:r>
-      <w:r>
-        <w:t xml:space="preserve">3.1.1</w:t>
-      </w:r>
-      <w:r>
-        <w:rPr>
-          <w:rFonts w:hint="eastAsia"/>
-        </w:rPr>
-        <w:t xml:space="preserve">节首次使用处一并标注。连同论文原有的伊辛映射</w:t>
+        <w:t>此前只出现在硬件投影参数的出处，现已在</w:t>
+      </w:r>
+      <w:r>
+        <w:t>3.1.1</w:t>
+      </w:r>
+      <w:r>
+        <w:rPr>
+          <w:rFonts w:hint="eastAsia"/>
+        </w:rPr>
+        <w:t>节首次使用处一并标注。连同论文原有的伊辛映射</w:t>
       </w:r>
       <w:r>
         <w:t xml:space="preserve"> (Lucas 2014)</w:t>
@@ -2728,7 +2810,7 @@
         <w:rPr>
           <w:rFonts w:hint="eastAsia"/>
         </w:rPr>
-        <w:t xml:space="preserve">、模拟退火</w:t>
+        <w:t>、模拟退火</w:t>
       </w:r>
       <w:r>
         <w:t xml:space="preserve"> (Kirkpatrick</w:t>
@@ -2737,7 +2819,7 @@
         <w:rPr>
           <w:rFonts w:hint="eastAsia"/>
         </w:rPr>
-        <w:t xml:space="preserve">等</w:t>
+        <w:t>等</w:t>
       </w:r>
       <w:r>
         <w:t xml:space="preserve"> 1983)</w:t>
@@ -2746,16 +2828,16 @@
         <w:rPr>
           <w:rFonts w:hint="eastAsia"/>
         </w:rPr>
-        <w:t xml:space="preserve">、</w:t>
-      </w:r>
-      <w:r>
-        <w:t xml:space="preserve">sMTJ</w:t>
-      </w:r>
-      <w:r>
-        <w:rPr>
-          <w:rFonts w:hint="eastAsia"/>
-        </w:rPr>
-        <w:t xml:space="preserve">概率计算实验</w:t>
+        <w:t>、</w:t>
+      </w:r>
+      <w:r>
+        <w:t>sMTJ</w:t>
+      </w:r>
+      <w:r>
+        <w:rPr>
+          <w:rFonts w:hint="eastAsia"/>
+        </w:rPr>
+        <w:t>概率计算实验</w:t>
       </w:r>
       <w:r>
         <w:t xml:space="preserve"> (Borders</w:t>
@@ -2764,7 +2846,7 @@
         <w:rPr>
           <w:rFonts w:hint="eastAsia"/>
         </w:rPr>
-        <w:t xml:space="preserve">等</w:t>
+        <w:t>等</w:t>
       </w:r>
       <w:r>
         <w:t xml:space="preserve"> 2019) </w:t>
@@ -2773,34 +2855,34 @@
         <w:rPr>
           <w:rFonts w:hint="eastAsia"/>
         </w:rPr>
-        <w:t xml:space="preserve">等引文，第</w:t>
-      </w:r>
-      <w:r>
-        <w:t xml:space="preserve">3</w:t>
-      </w:r>
-      <w:r>
-        <w:rPr>
-          <w:rFonts w:hint="eastAsia"/>
-        </w:rPr>
-        <w:t xml:space="preserve">章每一个理论与方法组件现在都能在使用处查到出处。全部文献的著录与</w:t>
-      </w:r>
-      <w:r>
-        <w:t xml:space="preserve">DOI</w:t>
-      </w:r>
-      <w:r>
-        <w:rPr>
-          <w:rFonts w:hint="eastAsia"/>
-        </w:rPr>
-        <w:t xml:space="preserve">链接见附件《本文与</w:t>
-      </w:r>
-      <w:r>
-        <w:t xml:space="preserve">Si</w:t>
-      </w:r>
-      <w:r>
-        <w:rPr>
-          <w:rFonts w:hint="eastAsia"/>
-        </w:rPr>
-        <w:t xml:space="preserve">等</w:t>
+        <w:t>等引文，第</w:t>
+      </w:r>
+      <w:r>
+        <w:t>3</w:t>
+      </w:r>
+      <w:r>
+        <w:rPr>
+          <w:rFonts w:hint="eastAsia"/>
+        </w:rPr>
+        <w:t>章每一个理论与方法组件现在都能在使用处查到出处。全部文献的著录与</w:t>
+      </w:r>
+      <w:r>
+        <w:t>DOI</w:t>
+      </w:r>
+      <w:r>
+        <w:rPr>
+          <w:rFonts w:hint="eastAsia"/>
+        </w:rPr>
+        <w:t>链接见附件《本文与</w:t>
+      </w:r>
+      <w:r>
+        <w:t>Si</w:t>
+      </w:r>
+      <w:r>
+        <w:rPr>
+          <w:rFonts w:hint="eastAsia"/>
+        </w:rPr>
+        <w:t>等</w:t>
       </w:r>
       <w:r>
         <w:t xml:space="preserve"> (2024) </w:t>
@@ -2809,7 +2891,7 @@
         <w:rPr>
           <w:rFonts w:hint="eastAsia"/>
         </w:rPr>
-        <w:t xml:space="preserve">工作的对比》文末的文献表。</w:t>
+        <w:t>工作的对比》文末的文献表。</w:t>
       </w:r>
     </w:p>
     <w:p>
@@ -2835,70 +2917,70 @@
         <w:rPr>
           <w:rFonts w:hint="eastAsia"/>
         </w:rPr>
-        <w:t xml:space="preserve">修改位置。第</w:t>
-      </w:r>
-      <w:r>
-        <w:t xml:space="preserve">3</w:t>
-      </w:r>
-      <w:r>
-        <w:rPr>
-          <w:rFonts w:hint="eastAsia"/>
-        </w:rPr>
-        <w:t xml:space="preserve">章</w:t>
-      </w:r>
-      <w:r>
-        <w:t xml:space="preserve">3.1.1</w:t>
-      </w:r>
-      <w:r>
-        <w:rPr>
-          <w:rFonts w:hint="eastAsia"/>
-        </w:rPr>
-        <w:t xml:space="preserve">、</w:t>
-      </w:r>
-      <w:r>
-        <w:t xml:space="preserve">3.3</w:t>
-      </w:r>
-      <w:r>
-        <w:rPr>
-          <w:rFonts w:hint="eastAsia"/>
-        </w:rPr>
-        <w:t xml:space="preserve">、</w:t>
-      </w:r>
-      <w:r>
-        <w:t xml:space="preserve">3.3.1</w:t>
-      </w:r>
-      <w:r>
-        <w:rPr>
-          <w:rFonts w:hint="eastAsia"/>
-        </w:rPr>
-        <w:t xml:space="preserve">、</w:t>
-      </w:r>
-      <w:r>
-        <w:t xml:space="preserve">3.3.3</w:t>
-      </w:r>
-      <w:r>
-        <w:rPr>
-          <w:rFonts w:hint="eastAsia"/>
-        </w:rPr>
-        <w:t xml:space="preserve">、</w:t>
-      </w:r>
-      <w:r>
-        <w:t xml:space="preserve">3.5.1</w:t>
-      </w:r>
-      <w:r>
-        <w:rPr>
-          <w:rFonts w:hint="eastAsia"/>
-        </w:rPr>
-        <w:t xml:space="preserve">、</w:t>
-      </w:r>
-      <w:r>
-        <w:t xml:space="preserve">3.5.5</w:t>
-      </w:r>
-      <w:r>
-        <w:rPr>
-          <w:rFonts w:hint="eastAsia"/>
-        </w:rPr>
-        <w:t xml:space="preserve">各节正文，以及章末参考文献表。</w:t>
+        <w:t>修改位置。第</w:t>
+      </w:r>
+      <w:r>
+        <w:t>3</w:t>
+      </w:r>
+      <w:r>
+        <w:rPr>
+          <w:rFonts w:hint="eastAsia"/>
+        </w:rPr>
+        <w:t>章</w:t>
+      </w:r>
+      <w:r>
+        <w:t>3.1.1</w:t>
+      </w:r>
+      <w:r>
+        <w:rPr>
+          <w:rFonts w:hint="eastAsia"/>
+        </w:rPr>
+        <w:t>、</w:t>
+      </w:r>
+      <w:r>
+        <w:t>3.3</w:t>
+      </w:r>
+      <w:r>
+        <w:rPr>
+          <w:rFonts w:hint="eastAsia"/>
+        </w:rPr>
+        <w:t>、</w:t>
+      </w:r>
+      <w:r>
+        <w:t>3.3.1</w:t>
+      </w:r>
+      <w:r>
+        <w:rPr>
+          <w:rFonts w:hint="eastAsia"/>
+        </w:rPr>
+        <w:t>、</w:t>
+      </w:r>
+      <w:r>
+        <w:t>3.3.3</w:t>
+      </w:r>
+      <w:r>
+        <w:rPr>
+          <w:rFonts w:hint="eastAsia"/>
+        </w:rPr>
+        <w:t>、</w:t>
+      </w:r>
+      <w:r>
+        <w:t>3.5.1</w:t>
+      </w:r>
+      <w:r>
+        <w:rPr>
+          <w:rFonts w:hint="eastAsia"/>
+        </w:rPr>
+        <w:t>、</w:t>
+      </w:r>
+      <w:r>
+        <w:t>3.5.5</w:t>
+      </w:r>
+      <w:r>
+        <w:rPr>
+          <w:rFonts w:hint="eastAsia"/>
+        </w:rPr>
+        <w:t>各节正文，以及章末参考文献表。</w:t>
       </w:r>
     </w:p>
     <w:p>
@@ -2910,16 +2992,16 @@
         <w:rPr>
           <w:rFonts w:hint="eastAsia"/>
         </w:rPr>
-        <w:t xml:space="preserve">意见三：补充</w:t>
-      </w:r>
-      <w:r>
-        <w:t xml:space="preserve">Si</w:t>
-      </w:r>
-      <w:r>
-        <w:rPr>
-          <w:rFonts w:hint="eastAsia"/>
-        </w:rPr>
-        <w:t xml:space="preserve">等</w:t>
+        <w:t>意见三：补充</w:t>
+      </w:r>
+      <w:r>
+        <w:t>Si</w:t>
+      </w:r>
+      <w:r>
+        <w:rPr>
+          <w:rFonts w:hint="eastAsia"/>
+        </w:rPr>
+        <w:t>等</w:t>
       </w:r>
       <w:r>
         <w:t xml:space="preserve"> (2024) </w:t>
@@ -2928,7 +3010,7 @@
         <w:rPr>
           <w:rFonts w:hint="eastAsia"/>
         </w:rPr>
-        <w:t xml:space="preserve">一文并说明本文与其不同之处</w:t>
+        <w:t>一文并说明本文与其不同之处</w:t>
       </w:r>
     </w:p>
     <w:p>
@@ -2954,52 +3036,52 @@
         <w:rPr>
           <w:rFonts w:hint="eastAsia"/>
         </w:rPr>
-        <w:t xml:space="preserve">修改说明。已在</w:t>
-      </w:r>
-      <w:r>
-        <w:t xml:space="preserve">3.3.3</w:t>
-      </w:r>
-      <w:r>
-        <w:rPr>
-          <w:rFonts w:hint="eastAsia"/>
-        </w:rPr>
-        <w:t xml:space="preserve">节</w:t>
-      </w:r>
-      <w:r>
-        <w:t xml:space="preserve">“</w:t>
-      </w:r>
-      <w:r>
-        <w:rPr>
-          <w:rFonts w:hint="eastAsia"/>
-        </w:rPr>
-        <w:t xml:space="preserve">问题布置与规模限制</w:t>
-      </w:r>
-      <w:r>
-        <w:t xml:space="preserve">”</w:t>
-      </w:r>
-      <w:r>
-        <w:rPr>
-          <w:rFonts w:hint="eastAsia"/>
-        </w:rPr>
-        <w:t xml:space="preserve">段补引该文，作为大规模</w:t>
-      </w:r>
-      <w:r>
-        <w:t xml:space="preserve">TSP</w:t>
-      </w:r>
-      <w:r>
-        <w:rPr>
-          <w:rFonts w:hint="eastAsia"/>
-        </w:rPr>
-        <w:t xml:space="preserve">依赖问题分解的硬件实验代表，与本文在求解器侧改造更新粒度的路线形成对照。两项工作的逐项差异整理为附件《本文与</w:t>
-      </w:r>
-      <w:r>
-        <w:t xml:space="preserve">Si</w:t>
-      </w:r>
-      <w:r>
-        <w:rPr>
-          <w:rFonts w:hint="eastAsia"/>
-        </w:rPr>
-        <w:t xml:space="preserve">等</w:t>
+        <w:t>修改说明。已在</w:t>
+      </w:r>
+      <w:r>
+        <w:t>3.3.3</w:t>
+      </w:r>
+      <w:r>
+        <w:rPr>
+          <w:rFonts w:hint="eastAsia"/>
+        </w:rPr>
+        <w:t>节</w:t>
+      </w:r>
+      <w:r>
+        <w:t>“</w:t>
+      </w:r>
+      <w:r>
+        <w:rPr>
+          <w:rFonts w:hint="eastAsia"/>
+        </w:rPr>
+        <w:t>问题布置与规模限制</w:t>
+      </w:r>
+      <w:r>
+        <w:t>”</w:t>
+      </w:r>
+      <w:r>
+        <w:rPr>
+          <w:rFonts w:hint="eastAsia"/>
+        </w:rPr>
+        <w:t>段补引该文，作为大规模</w:t>
+      </w:r>
+      <w:r>
+        <w:t>TSP</w:t>
+      </w:r>
+      <w:r>
+        <w:rPr>
+          <w:rFonts w:hint="eastAsia"/>
+        </w:rPr>
+        <w:t>依赖问题分解的硬件实验代表，与本文在求解器侧改造更新粒度的路线形成对照。两项工作的逐项差异整理为附件《本文与</w:t>
+      </w:r>
+      <w:r>
+        <w:t>Si</w:t>
+      </w:r>
+      <w:r>
+        <w:rPr>
+          <w:rFonts w:hint="eastAsia"/>
+        </w:rPr>
+        <w:t>等</w:t>
       </w:r>
       <w:r>
         <w:t xml:space="preserve"> (2024) </w:t>
@@ -3008,16 +3090,16 @@
         <w:rPr>
           <w:rFonts w:hint="eastAsia"/>
         </w:rPr>
-        <w:t xml:space="preserve">工作的对比》随修改稿一并提交，从工作性质、器件与随机性的使用方式、退火与采样规则、</w:t>
-      </w:r>
-      <w:r>
-        <w:t xml:space="preserve">TSP</w:t>
-      </w:r>
-      <w:r>
-        <w:rPr>
-          <w:rFonts w:hint="eastAsia"/>
-        </w:rPr>
-        <w:t xml:space="preserve">路线、能耗数字的口径、阵列化分析的层次六个方面说明，要点如下。</w:t>
+        <w:t>工作的对比》随修改稿一并提交，从工作性质、器件与随机性的使用方式、退火与采样规则、</w:t>
+      </w:r>
+      <w:r>
+        <w:t>TSP</w:t>
+      </w:r>
+      <w:r>
+        <w:rPr>
+          <w:rFonts w:hint="eastAsia"/>
+        </w:rPr>
+        <w:t>路线、能耗数字的口径、阵列化分析的层次六个方面说明，要点如下。</w:t>
       </w:r>
     </w:p>
     <w:p>
@@ -3043,97 +3125,97 @@
         <w:rPr>
           <w:rFonts w:hint="eastAsia"/>
         </w:rPr>
-        <w:t xml:space="preserve">该文的成果是一台可运行的硬件系统与一套问题压缩算法，即</w:t>
-      </w:r>
-      <w:r>
-        <w:t xml:space="preserve">80</w:t>
-      </w:r>
-      <w:r>
-        <w:rPr>
-          <w:rFonts w:hint="eastAsia"/>
-        </w:rPr>
-        <w:t xml:space="preserve">器件</w:t>
-      </w:r>
-      <w:r>
-        <w:t xml:space="preserve">PCB</w:t>
-      </w:r>
-      <w:r>
-        <w:rPr>
-          <w:rFonts w:hint="eastAsia"/>
-        </w:rPr>
-        <w:t xml:space="preserve">实验、图分割加约束</w:t>
-      </w:r>
-      <w:r>
-        <w:t xml:space="preserve">TSP</w:t>
-      </w:r>
-      <w:r>
-        <w:rPr>
-          <w:rFonts w:hint="eastAsia"/>
-        </w:rPr>
-        <w:t xml:space="preserve">的分解流程与交叉杆架构提议；本文的成果是跨层评估方法与设计规则，同一组实例、退火协议与随机种子贯通算法、器件、电路三层，产出灵敏度排序、归一化容差与口径修正。器件工作方式不同：该文器件在直流偏置下自由涨落，以约</w:t>
-      </w:r>
-      <w:r>
-        <w:t xml:space="preserve">0.1 ms</w:t>
-      </w:r>
-      <w:r>
-        <w:rPr>
-          <w:rFonts w:hint="eastAsia"/>
-        </w:rPr>
-        <w:t xml:space="preserve">的保持时间为节拍被动读出，主频</w:t>
-      </w:r>
-      <w:r>
-        <w:t xml:space="preserve">10 kHz</w:t>
-      </w:r>
-      <w:r>
-        <w:rPr>
-          <w:rFonts w:hint="eastAsia"/>
-        </w:rPr>
-        <w:t xml:space="preserve">；本文器件为</w:t>
-      </w:r>
-      <w:r>
-        <w:t xml:space="preserve">SOT</w:t>
-      </w:r>
-      <w:r>
-        <w:rPr>
-          <w:rFonts w:hint="eastAsia"/>
-        </w:rPr>
-        <w:t xml:space="preserve">脉冲写入型，每次更新是复位加</w:t>
-      </w:r>
-      <w:r>
-        <w:t xml:space="preserve">0.75 ns</w:t>
-      </w:r>
-      <w:r>
-        <w:rPr>
-          <w:rFonts w:hint="eastAsia"/>
-        </w:rPr>
-        <w:t xml:space="preserve">概率写的同步事件。</w:t>
-      </w:r>
-      <w:r>
-        <w:t xml:space="preserve">TSP</w:t>
-      </w:r>
-      <w:r>
-        <w:rPr>
-          <w:rFonts w:hint="eastAsia"/>
-        </w:rPr>
-        <w:t xml:space="preserve">路线正交：该文在问题侧做分解，本文在求解器侧把更新粒度从单自旋改为置换簇更新，两条路线可以组合。能耗口径不同：该文报告的</w:t>
-      </w:r>
-      <w:r>
-        <w:t xml:space="preserve">0.64 mW</w:t>
-      </w:r>
-      <w:r>
-        <w:rPr>
-          <w:rFonts w:hint="eastAsia"/>
-        </w:rPr>
-        <w:t xml:space="preserve">为计算内核口径，本文实测外围驱动的静态功耗与建立时间使端到端能耗较器件级放大约</w:t>
-      </w:r>
-      <w:r>
-        <w:t xml:space="preserve">18.7</w:t>
-      </w:r>
-      <w:r>
-        <w:rPr>
-          <w:rFonts w:hint="eastAsia"/>
-        </w:rPr>
-        <w:t xml:space="preserve">倍，并据此指出跨平台能耗结论必须与口径边界一并陈述。</w:t>
+        <w:t>该文的成果是一台可运行的硬件系统与一套问题压缩算法，即</w:t>
+      </w:r>
+      <w:r>
+        <w:t>80</w:t>
+      </w:r>
+      <w:r>
+        <w:rPr>
+          <w:rFonts w:hint="eastAsia"/>
+        </w:rPr>
+        <w:t>器件</w:t>
+      </w:r>
+      <w:r>
+        <w:t>PCB</w:t>
+      </w:r>
+      <w:r>
+        <w:rPr>
+          <w:rFonts w:hint="eastAsia"/>
+        </w:rPr>
+        <w:t>实验、图分割加约束</w:t>
+      </w:r>
+      <w:r>
+        <w:t>TSP</w:t>
+      </w:r>
+      <w:r>
+        <w:rPr>
+          <w:rFonts w:hint="eastAsia"/>
+        </w:rPr>
+        <w:t>的分解流程与交叉杆架构提议；本文的成果是跨层评估方法与设计规则，同一组实例、退火协议与随机种子贯通算法、器件、电路三层，产出灵敏度排序、归一化容差与口径修正。器件工作方式不同：该文器件在直流偏置下自由涨落，以约</w:t>
+      </w:r>
+      <w:r>
+        <w:t>0.1 ms</w:t>
+      </w:r>
+      <w:r>
+        <w:rPr>
+          <w:rFonts w:hint="eastAsia"/>
+        </w:rPr>
+        <w:t>的保持时间为节拍被动读出，主频</w:t>
+      </w:r>
+      <w:r>
+        <w:t>10 kHz</w:t>
+      </w:r>
+      <w:r>
+        <w:rPr>
+          <w:rFonts w:hint="eastAsia"/>
+        </w:rPr>
+        <w:t>；本文器件为</w:t>
+      </w:r>
+      <w:r>
+        <w:t>SOT</w:t>
+      </w:r>
+      <w:r>
+        <w:rPr>
+          <w:rFonts w:hint="eastAsia"/>
+        </w:rPr>
+        <w:t>脉冲写入型，每次更新是复位加</w:t>
+      </w:r>
+      <w:r>
+        <w:t>0.75 ns</w:t>
+      </w:r>
+      <w:r>
+        <w:rPr>
+          <w:rFonts w:hint="eastAsia"/>
+        </w:rPr>
+        <w:t>概率写的同步事件。</w:t>
+      </w:r>
+      <w:r>
+        <w:t>TSP</w:t>
+      </w:r>
+      <w:r>
+        <w:rPr>
+          <w:rFonts w:hint="eastAsia"/>
+        </w:rPr>
+        <w:t>路线正交：该文在问题侧做分解，本文在求解器侧把更新粒度从单自旋改为置换簇更新，两条路线可以组合。能耗口径不同：该文报告的</w:t>
+      </w:r>
+      <w:r>
+        <w:t>0.64 mW</w:t>
+      </w:r>
+      <w:r>
+        <w:rPr>
+          <w:rFonts w:hint="eastAsia"/>
+        </w:rPr>
+        <w:t>为计算内核口径，本文实测外围驱动的静态功耗与建立时间使端到端能耗较器件级放大约</w:t>
+      </w:r>
+      <w:r>
+        <w:t>18.7</w:t>
+      </w:r>
+      <w:r>
+        <w:rPr>
+          <w:rFonts w:hint="eastAsia"/>
+        </w:rPr>
+        <w:t>倍，并据此指出跨平台能耗结论必须与口径边界一并陈述。</w:t>
       </w:r>
     </w:p>
     <w:p>
@@ -3159,34 +3241,34 @@
         <w:rPr>
           <w:rFonts w:hint="eastAsia"/>
         </w:rPr>
-        <w:t xml:space="preserve">修改位置。第</w:t>
-      </w:r>
-      <w:r>
-        <w:t xml:space="preserve">3</w:t>
-      </w:r>
-      <w:r>
-        <w:rPr>
-          <w:rFonts w:hint="eastAsia"/>
-        </w:rPr>
-        <w:t xml:space="preserve">章</w:t>
-      </w:r>
-      <w:r>
-        <w:t xml:space="preserve">3.3.3</w:t>
-      </w:r>
-      <w:r>
-        <w:rPr>
-          <w:rFonts w:hint="eastAsia"/>
-        </w:rPr>
-        <w:t xml:space="preserve">节与章末参考文献表；附件《本文与</w:t>
-      </w:r>
-      <w:r>
-        <w:t xml:space="preserve">Si</w:t>
-      </w:r>
-      <w:r>
-        <w:rPr>
-          <w:rFonts w:hint="eastAsia"/>
-        </w:rPr>
-        <w:t xml:space="preserve">等</w:t>
+        <w:t>修改位置。第</w:t>
+      </w:r>
+      <w:r>
+        <w:t>3</w:t>
+      </w:r>
+      <w:r>
+        <w:rPr>
+          <w:rFonts w:hint="eastAsia"/>
+        </w:rPr>
+        <w:t>章</w:t>
+      </w:r>
+      <w:r>
+        <w:t>3.3.3</w:t>
+      </w:r>
+      <w:r>
+        <w:rPr>
+          <w:rFonts w:hint="eastAsia"/>
+        </w:rPr>
+        <w:t>节与章末参考文献表；附件《本文与</w:t>
+      </w:r>
+      <w:r>
+        <w:t>Si</w:t>
+      </w:r>
+      <w:r>
+        <w:rPr>
+          <w:rFonts w:hint="eastAsia"/>
+        </w:rPr>
+        <w:t>等</w:t>
       </w:r>
       <w:r>
         <w:t xml:space="preserve"> (2024) </w:t>
@@ -3195,7 +3277,7 @@
         <w:rPr>
           <w:rFonts w:hint="eastAsia"/>
         </w:rPr>
-        <w:t xml:space="preserve">工作的对比》。</w:t>
+        <w:t>工作的对比》。</w:t>
       </w:r>
     </w:p>
     <w:p>
@@ -3207,7 +3289,7 @@
         <w:rPr>
           <w:rFonts w:hint="eastAsia"/>
         </w:rPr>
-        <w:t xml:space="preserve">关于方法来源与自研工作的边界</w:t>
+        <w:t>关于方法来源与自研工作的边界</w:t>
       </w:r>
     </w:p>
     <w:p>
@@ -3233,7 +3315,7 @@
         <w:rPr>
           <w:rFonts w:hint="eastAsia"/>
         </w:rPr>
-        <w:t xml:space="preserve">按专家关于理论是否都来自参考文献、设计实现是否自己完成的问法，此处一并说明。</w:t>
+        <w:t>按专家关于理论是否都来自参考文献、设计实现是否自己完成的问法，此处一并说明。</w:t>
       </w:r>
     </w:p>
     <w:p>
@@ -3259,34 +3341,34 @@
         <w:rPr>
           <w:rFonts w:hint="eastAsia"/>
         </w:rPr>
-        <w:t xml:space="preserve">理论组件均来自上述公开文献，公式可由文献给出的定义从头推导，本文未在这一层提出新的理论。自主完成的是设计与实现：开源仿真框架与全部基准代码、器件行为模型及第二章标定参数的接入、</w:t>
-      </w:r>
-      <w:r>
-        <w:t xml:space="preserve">sky130</w:t>
-      </w:r>
-      <w:r>
-        <w:rPr>
-          <w:rFonts w:hint="eastAsia"/>
-        </w:rPr>
-        <w:t xml:space="preserve">工艺下的晶体管级测试台与全部电路实验，以及全部实验数据的生成与统计分析。本文是纯仿真工作，第</w:t>
-      </w:r>
-      <w:r>
-        <w:t xml:space="preserve">3</w:t>
-      </w:r>
-      <w:r>
-        <w:rPr>
-          <w:rFonts w:hint="eastAsia"/>
-        </w:rPr>
-        <w:t xml:space="preserve">章所有结果均带随机种子记录，可由随论文归档的脚本复现，未使用任何外部未公开代码。就</w:t>
-      </w:r>
-      <w:r>
-        <w:t xml:space="preserve">Si</w:t>
-      </w:r>
-      <w:r>
-        <w:rPr>
-          <w:rFonts w:hint="eastAsia"/>
-        </w:rPr>
-        <w:t xml:space="preserve">等</w:t>
+        <w:t>理论组件均来自上述公开文献，公式可由文献给出的定义从头推导，本文未在这一层提出新的理论。自主完成的是设计与实现：开源仿真框架与全部基准代码、器件行为模型及第二章标定参数的接入、</w:t>
+      </w:r>
+      <w:r>
+        <w:t>sky130</w:t>
+      </w:r>
+      <w:r>
+        <w:rPr>
+          <w:rFonts w:hint="eastAsia"/>
+        </w:rPr>
+        <w:t>工艺下的晶体管级测试台与全部电路实验，以及全部实验数据的生成与统计分析。本文是纯仿真工作，第</w:t>
+      </w:r>
+      <w:r>
+        <w:t>3</w:t>
+      </w:r>
+      <w:r>
+        <w:rPr>
+          <w:rFonts w:hint="eastAsia"/>
+        </w:rPr>
+        <w:t>章所有结果均带随机种子记录，可由随论文归档的脚本复现，未使用任何外部未公开代码。就</w:t>
+      </w:r>
+      <w:r>
+        <w:t>Si</w:t>
+      </w:r>
+      <w:r>
+        <w:rPr>
+          <w:rFonts w:hint="eastAsia"/>
+        </w:rPr>
+        <w:t>等</w:t>
       </w:r>
       <w:r>
         <w:t xml:space="preserve"> (2024) </w:t>
@@ -3295,29 +3377,32 @@
         <w:rPr>
           <w:rFonts w:hint="eastAsia"/>
         </w:rPr>
-        <w:t xml:space="preserve">而言，该文代码未公开，其文末注明需向通讯作者索取，作者未曾索取，本文实现与其没有交集。</w:t>
+        <w:t>而言，该文代码未公开，其文末注明需向通讯作者索取，作者未曾索取，本文实现与其没有交集。</w:t>
       </w:r>
     </w:p>
     <w:p>
       <w:pPr>
-        <w:pStyle w:val="5"/>
-        <w:bidi w:val="0"/>
+        <w:pStyle w:val="4"/>
+        <w:rPr>
+          <w:rFonts w:hint="eastAsia"/>
+        </w:rPr>
       </w:pPr>
-      <w:r>
-        <w:rPr>
-          <w:rFonts w:hint="eastAsia"/>
-        </w:rPr>
-        <w:t xml:space="preserve">关于第</w:t>
-      </w:r>
-      <w:r>
-        <w:t xml:space="preserve">3</w:t>
-      </w:r>
-      <w:r>
-        <w:rPr>
-          <w:rFonts w:hint="eastAsia"/>
-        </w:rPr>
-        <w:t xml:space="preserve">章核心结论口径的说明</w:t>
-      </w:r>
+    </w:p>
+    <w:p>
+      <w:pPr>
+        <w:pStyle w:val="4"/>
+        <w:rPr>
+          <w:rFonts w:hint="eastAsia"/>
+        </w:rPr>
+      </w:pPr>
+    </w:p>
+    <w:p>
+      <w:pPr>
+        <w:pStyle w:val="4"/>
+        <w:rPr>
+          <w:rFonts w:hint="eastAsia"/>
+        </w:rPr>
+      </w:pPr>
     </w:p>
     <w:p>
       <w:pPr>
@@ -3338,274 +3423,11 @@
         <w:ind w:firstLine="420" w:firstLineChars="200"/>
         <w:jc w:val="left"/>
       </w:pPr>
-      <w:r>
-        <w:rPr>
-          <w:rFonts w:hint="eastAsia"/>
-        </w:rPr>
-        <w:t xml:space="preserve">评阅意见的总体评价提到</w:t>
-      </w:r>
-      <w:r>
-        <w:t xml:space="preserve">“</w:t>
-      </w:r>
-      <w:r>
-        <w:rPr>
-          <w:rFonts w:hint="eastAsia"/>
-        </w:rPr>
-        <w:t xml:space="preserve">验证了</w:t>
-      </w:r>
-      <w:r>
-        <w:t xml:space="preserve">sMTJ-Gibbs</w:t>
-      </w:r>
-      <w:r>
-        <w:rPr>
-          <w:rFonts w:hint="eastAsia"/>
-        </w:rPr>
-        <w:t xml:space="preserve">采样的大规模稠密图加速优势</w:t>
-      </w:r>
-      <w:r>
-        <w:t xml:space="preserve">”</w:t>
-      </w:r>
-      <w:r>
-        <w:rPr>
-          <w:rFonts w:hint="eastAsia"/>
-        </w:rPr>
-        <w:t xml:space="preserve">。为避免答辩时产生歧义，此处明确本文在这一点上的结论口径。</w:t>
-      </w:r>
     </w:p>
     <w:p>
       <w:pPr>
-        <w:pStyle w:val="45"/>
-        <w:keepNext w:val="0"/>
-        <w:keepLines w:val="0"/>
-        <w:pageBreakBefore w:val="0"/>
-        <w:widowControl/>
-        <w:kinsoku/>
-        <w:wordWrap/>
-        <w:overflowPunct/>
-        <w:topLinePunct w:val="0"/>
-        <w:autoSpaceDE/>
-        <w:autoSpaceDN/>
-        <w:bidi w:val="0"/>
-        <w:snapToGrid/>
-        <w:spacing w:line="240" w:lineRule="auto"/>
-        <w:ind w:firstLine="420" w:firstLineChars="200"/>
-        <w:jc w:val="left"/>
+        <w:pStyle w:val="4"/>
       </w:pPr>
-      <w:r>
-        <w:rPr>
-          <w:rFonts w:hint="eastAsia"/>
-        </w:rPr>
-        <w:t xml:space="preserve">第</w:t>
-      </w:r>
-      <w:r>
-        <w:t xml:space="preserve">3</w:t>
-      </w:r>
-      <w:r>
-        <w:rPr>
-          <w:rFonts w:hint="eastAsia"/>
-        </w:rPr>
-        <w:t xml:space="preserve">章的受控对照在共享退火调度、扫数与随机种子、仅替换单步更新规则的条件下比较了</w:t>
-      </w:r>
-      <w:r>
-        <w:t xml:space="preserve">sMTJ-Gibbs</w:t>
-      </w:r>
-      <w:r>
-        <w:rPr>
-          <w:rFonts w:hint="eastAsia"/>
-        </w:rPr>
-        <w:t xml:space="preserve">采样与经典</w:t>
-      </w:r>
-      <w:r>
-        <w:t xml:space="preserve">Metropolis</w:t>
-      </w:r>
-      <w:r>
-        <w:rPr>
-          <w:rFonts w:hint="eastAsia"/>
-        </w:rPr>
-        <w:t xml:space="preserve">模拟退火，结论是算法层没有可分辨的加速：十四个实例中十二个的速比落在</w:t>
-      </w:r>
-      <w:r>
-        <w:t xml:space="preserve">0.74</w:t>
-      </w:r>
-      <w:r>
-        <w:rPr>
-          <w:rFonts w:hint="eastAsia"/>
-        </w:rPr>
-        <w:t xml:space="preserve">倍至</w:t>
-      </w:r>
-      <w:r>
-        <w:t xml:space="preserve">1.11</w:t>
-      </w:r>
-      <w:r>
-        <w:rPr>
-          <w:rFonts w:hint="eastAsia"/>
-        </w:rPr>
-        <w:t xml:space="preserve">倍区间；稠密同号图</w:t>
-      </w:r>
-      <w:r>
-        <w:t xml:space="preserve">G1</w:t>
-      </w:r>
-      <w:r>
-        <w:rPr>
-          <w:rFonts w:hint="eastAsia"/>
-        </w:rPr>
-        <w:t xml:space="preserve">上</w:t>
-      </w:r>
-      <w:r>
-        <w:t xml:space="preserve">Metropolis</w:t>
-      </w:r>
-      <w:r>
-        <w:rPr>
-          <w:rFonts w:hint="eastAsia"/>
-        </w:rPr>
-        <w:t xml:space="preserve">反而保有小幅优势</w:t>
-      </w:r>
-      <w:r>
-        <w:t xml:space="preserve"> (0.84</w:t>
-      </w:r>
-      <w:r>
-        <w:rPr>
-          <w:rFonts w:hint="eastAsia"/>
-        </w:rPr>
-        <w:t xml:space="preserve">倍</w:t>
-      </w:r>
-      <w:r>
-        <w:t xml:space="preserve">)</w:t>
-      </w:r>
-      <w:r>
-        <w:rPr>
-          <w:rFonts w:hint="eastAsia"/>
-        </w:rPr>
-        <w:t xml:space="preserve">，方向与</w:t>
-      </w:r>
-      <w:r>
-        <w:t xml:space="preserve">Peskun</w:t>
-      </w:r>
-      <w:r>
-        <w:rPr>
-          <w:rFonts w:hint="eastAsia"/>
-        </w:rPr>
-        <w:t xml:space="preserve">对同平稳分布可逆链的效率排序一致；规模最大的</w:t>
-      </w:r>
-      <w:r>
-        <w:t xml:space="preserve">G22</w:t>
-      </w:r>
-      <w:r>
-        <w:rPr>
-          <w:rFonts w:hint="eastAsia"/>
-        </w:rPr>
-        <w:t xml:space="preserve">曾出现</w:t>
-      </w:r>
-      <w:r>
-        <w:t xml:space="preserve">3.71</w:t>
-      </w:r>
-      <w:r>
-        <w:rPr>
-          <w:rFonts w:hint="eastAsia"/>
-        </w:rPr>
-        <w:t xml:space="preserve">倍的表观加速，但该点两臂命中数仅为</w:t>
-      </w:r>
-      <w:r>
-        <w:t xml:space="preserve">4</w:t>
-      </w:r>
-      <w:r>
-        <w:rPr>
-          <w:rFonts w:hint="eastAsia"/>
-        </w:rPr>
-        <w:t xml:space="preserve">比</w:t>
-      </w:r>
-      <w:r>
-        <w:t xml:space="preserve">1</w:t>
-      </w:r>
-      <w:r>
-        <w:rPr>
-          <w:rFonts w:hint="eastAsia"/>
-        </w:rPr>
-        <w:t xml:space="preserve">，把试验数扩到</w:t>
-      </w:r>
-      <w:r>
-        <w:t xml:space="preserve">2000</w:t>
-      </w:r>
-      <w:r>
-        <w:rPr>
-          <w:rFonts w:hint="eastAsia"/>
-        </w:rPr>
-        <w:t xml:space="preserve">后速比回落且置信区间跨越</w:t>
-      </w:r>
-      <w:r>
-        <w:t xml:space="preserve">1</w:t>
-      </w:r>
-      <w:r>
-        <w:rPr>
-          <w:rFonts w:hint="eastAsia"/>
-        </w:rPr>
-        <w:t xml:space="preserve">，故未作为加速证据保留。</w:t>
-      </w:r>
-      <w:r>
-        <w:t xml:space="preserve">sMTJ</w:t>
-      </w:r>
-      <w:r>
-        <w:rPr>
-          <w:rFonts w:hint="eastAsia"/>
-        </w:rPr>
-        <w:t xml:space="preserve">的价值因此定位在物理实现层，即由器件的单个写脉冲直接产生条件样本、省去随机数生成与判决逻辑；这一收益能否在阵列层兑现取决于外围开销，</w:t>
-      </w:r>
-      <w:r>
-        <w:t xml:space="preserve">3.5</w:t>
-      </w:r>
-      <w:r>
-        <w:rPr>
-          <w:rFonts w:hint="eastAsia"/>
-        </w:rPr>
-        <w:t xml:space="preserve">节给出的端到端修正为约</w:t>
-      </w:r>
-      <w:r>
-        <w:t xml:space="preserve">18.7</w:t>
-      </w:r>
-      <w:r>
-        <w:rPr>
-          <w:rFonts w:hint="eastAsia"/>
-        </w:rPr>
-        <w:t xml:space="preserve">倍。若评阅意见所指为硬件投影层面稠密图上的时间与能耗优势，则与本文结论一致；若理解为算法层的加速，则与本文结论相反，特此说明。</w:t>
-      </w:r>
-    </w:p>
-    <w:p>
-      <w:pPr>
-        <w:pStyle w:val="5"/>
-        <w:bidi w:val="0"/>
-      </w:pPr>
-      <w:r>
-        <w:rPr>
-          <w:rFonts w:hint="eastAsia"/>
-        </w:rPr>
-        <w:t xml:space="preserve">其他</w:t>
-      </w:r>
-    </w:p>
-    <w:p>
-      <w:pPr>
-        <w:pStyle w:val="45"/>
-        <w:keepNext w:val="0"/>
-        <w:keepLines w:val="0"/>
-        <w:pageBreakBefore w:val="0"/>
-        <w:widowControl/>
-        <w:kinsoku/>
-        <w:wordWrap/>
-        <w:overflowPunct/>
-        <w:topLinePunct w:val="0"/>
-        <w:autoSpaceDE/>
-        <w:autoSpaceDN/>
-        <w:bidi w:val="0"/>
-        <w:snapToGrid/>
-        <w:spacing w:line="240" w:lineRule="auto"/>
-        <w:ind w:firstLine="420" w:firstLineChars="200"/>
-        <w:jc w:val="left"/>
-      </w:pPr>
-      <w:r>
-        <w:rPr>
-          <w:rFonts w:hint="eastAsia"/>
-        </w:rPr>
-        <w:t xml:space="preserve">上述修改均已落实，论文其余部分未作改动。若评阅书另有具体修改意见，将按同一格式逐条补充说明。</w:t>
-      </w:r>
     </w:p>
     <w:sectPr>
       <w:footnotePr>
@@ -5049,6 +4871,7 @@
   <w:style w:type="character" w:customStyle="1" w:styleId="93">
     <w:name w:val="VariableTok"/>
     <w:basedOn w:val="70"/>
+    <w:qFormat/>
     <w:uiPriority w:val="0"/>
     <w:rPr>
       <w:color w:val="19177C"/>
@@ -5067,6 +4890,7 @@
   <w:style w:type="character" w:customStyle="1" w:styleId="95">
     <w:name w:val="OperatorTok"/>
     <w:basedOn w:val="70"/>
+    <w:qFormat/>
     <w:uiPriority w:val="0"/>
     <w:rPr>
       <w:color w:val="666666"/>
@@ -5075,6 +4899,7 @@
   <w:style w:type="character" w:customStyle="1" w:styleId="96">
     <w:name w:val="BuiltInTok"/>
     <w:basedOn w:val="70"/>
+    <w:qFormat/>
     <w:uiPriority w:val="0"/>
     <w:rPr>
       <w:color w:val="008000"/>
@@ -5083,6 +4908,7 @@
   <w:style w:type="character" w:customStyle="1" w:styleId="97">
     <w:name w:val="ExtensionTok"/>
     <w:basedOn w:val="70"/>
+    <w:qFormat/>
     <w:uiPriority w:val="0"/>
   </w:style>
   <w:style w:type="character" w:customStyle="1" w:styleId="98">
@@ -5097,6 +4923,7 @@
   <w:style w:type="character" w:customStyle="1" w:styleId="99">
     <w:name w:val="AttributeTok"/>
     <w:basedOn w:val="70"/>
+    <w:qFormat/>
     <w:uiPriority w:val="0"/>
     <w:rPr>
       <w:color w:val="7D9029"/>
@@ -5105,11 +4932,13 @@
   <w:style w:type="character" w:customStyle="1" w:styleId="100">
     <w:name w:val="RegionMarkerTok"/>
     <w:basedOn w:val="70"/>
+    <w:qFormat/>
     <w:uiPriority w:val="0"/>
   </w:style>
   <w:style w:type="character" w:customStyle="1" w:styleId="101">
     <w:name w:val="InformationTok"/>
     <w:basedOn w:val="70"/>
+    <w:qFormat/>
     <w:uiPriority w:val="0"/>
     <w:rPr>
       <w:b/>
@@ -5120,6 +4949,7 @@
   <w:style w:type="character" w:customStyle="1" w:styleId="102">
     <w:name w:val="WarningTok"/>
     <w:basedOn w:val="70"/>
+    <w:qFormat/>
     <w:uiPriority w:val="0"/>
     <w:rPr>
       <w:b/>
@@ -5130,6 +4960,7 @@
   <w:style w:type="character" w:customStyle="1" w:styleId="103">
     <w:name w:val="AlertTok"/>
     <w:basedOn w:val="70"/>
+    <w:qFormat/>
     <w:uiPriority w:val="0"/>
     <w:rPr>
       <w:b/>
@@ -5139,6 +4970,7 @@
   <w:style w:type="character" w:customStyle="1" w:styleId="104">
     <w:name w:val="ErrorTok"/>
     <w:basedOn w:val="70"/>
+    <w:qFormat/>
     <w:uiPriority w:val="0"/>
     <w:rPr>
       <w:b/>
@@ -5148,6 +4980,7 @@
   <w:style w:type="character" w:customStyle="1" w:styleId="105">
     <w:name w:val="NormalTok"/>
     <w:basedOn w:val="70"/>
+    <w:qFormat/>
     <w:uiPriority w:val="0"/>
   </w:style>
   <w:style w:type="character" w:customStyle="1" w:styleId="106">

</xml_diff>